<commit_message>
Update EPRO_Entrega3_Grupo9_Plataforma de gestión documental con versiones.docx
</commit_message>
<xml_diff>
--- a/docs/entrega3/EPRO_Entrega3_Grupo9_Plataforma de gestión documental con versiones.docx
+++ b/docs/entrega3/EPRO_Entrega3_Grupo9_Plataforma de gestión documental con versiones.docx
@@ -1218,113 +1218,66 @@
           <w:r>
             <w:fldChar w:fldCharType="separate"/>
           </w:r>
-          <w:bookmarkStart w:id="1" w:name="_GoBack"/>
-          <w:bookmarkEnd w:id="1"/>
-          <w:r>
-            <w:rPr>
-              <w:rStyle w:val="Hipervnculo"/>
-              <w:noProof/>
-            </w:rPr>
-            <w:fldChar w:fldCharType="begin"/>
-          </w:r>
-          <w:r>
-            <w:rPr>
-              <w:rStyle w:val="Hipervnculo"/>
-              <w:noProof/>
-            </w:rPr>
-            <w:instrText xml:space="preserve"> </w:instrText>
-          </w:r>
-          <w:r>
-            <w:rPr>
-              <w:noProof/>
-            </w:rPr>
-            <w:instrText>HYPERLINK \l "_Toc224899159"</w:instrText>
-          </w:r>
-          <w:r>
-            <w:rPr>
-              <w:rStyle w:val="Hipervnculo"/>
-              <w:noProof/>
-            </w:rPr>
-            <w:instrText xml:space="preserve"> </w:instrText>
-          </w:r>
-          <w:r>
-            <w:rPr>
-              <w:rStyle w:val="Hipervnculo"/>
-              <w:noProof/>
-            </w:rPr>
-          </w:r>
-          <w:r>
-            <w:rPr>
-              <w:rStyle w:val="Hipervnculo"/>
-              <w:noProof/>
-            </w:rPr>
-            <w:fldChar w:fldCharType="separate"/>
-          </w:r>
-          <w:r>
-            <w:rPr>
-              <w:rStyle w:val="Hipervnculo"/>
-              <w:rFonts w:ascii="Arial" w:hAnsi="Arial" w:cs="Arial"/>
-              <w:b/>
-              <w:bCs/>
-              <w:noProof/>
-            </w:rPr>
-            <w:t>Arquitectura Propuesta</w:t>
-          </w:r>
-          <w:r>
-            <w:rPr>
-              <w:noProof/>
-              <w:webHidden/>
-            </w:rPr>
-            <w:tab/>
-          </w:r>
-          <w:r>
-            <w:rPr>
-              <w:noProof/>
-              <w:webHidden/>
-            </w:rPr>
-            <w:fldChar w:fldCharType="begin"/>
-          </w:r>
-          <w:r>
-            <w:rPr>
-              <w:noProof/>
-              <w:webHidden/>
-            </w:rPr>
-            <w:instrText xml:space="preserve"> PAGEREF _Toc224899159 \h </w:instrText>
-          </w:r>
-          <w:r>
-            <w:rPr>
-              <w:noProof/>
-              <w:webHidden/>
-            </w:rPr>
-          </w:r>
-          <w:r>
-            <w:rPr>
-              <w:noProof/>
-              <w:webHidden/>
-            </w:rPr>
-            <w:fldChar w:fldCharType="separate"/>
-          </w:r>
-          <w:r>
-            <w:rPr>
-              <w:noProof/>
-              <w:webHidden/>
-            </w:rPr>
-            <w:t>2</w:t>
-          </w:r>
-          <w:r>
-            <w:rPr>
-              <w:noProof/>
-              <w:webHidden/>
-            </w:rPr>
-            <w:fldChar w:fldCharType="end"/>
-          </w:r>
-          <w:r>
-            <w:rPr>
-              <w:rStyle w:val="Hipervnculo"/>
-              <w:noProof/>
-            </w:rPr>
-            <w:fldChar w:fldCharType="end"/>
-          </w:r>
+          <w:hyperlink w:anchor="_Toc224899159" w:history="1">
+            <w:r>
+              <w:rPr>
+                <w:rStyle w:val="Hipervnculo"/>
+                <w:rFonts w:ascii="Arial" w:hAnsi="Arial" w:cs="Arial"/>
+                <w:b/>
+                <w:bCs/>
+                <w:noProof/>
+              </w:rPr>
+              <w:t>Arquitectura Propuesta</w:t>
+            </w:r>
+            <w:r>
+              <w:rPr>
+                <w:noProof/>
+                <w:webHidden/>
+              </w:rPr>
+              <w:tab/>
+            </w:r>
+            <w:r>
+              <w:rPr>
+                <w:noProof/>
+                <w:webHidden/>
+              </w:rPr>
+              <w:fldChar w:fldCharType="begin"/>
+            </w:r>
+            <w:r>
+              <w:rPr>
+                <w:noProof/>
+                <w:webHidden/>
+              </w:rPr>
+              <w:instrText xml:space="preserve"> PAGEREF _Toc224899159 \h </w:instrText>
+            </w:r>
+            <w:r>
+              <w:rPr>
+                <w:noProof/>
+                <w:webHidden/>
+              </w:rPr>
+            </w:r>
+            <w:r>
+              <w:rPr>
+                <w:noProof/>
+                <w:webHidden/>
+              </w:rPr>
+              <w:fldChar w:fldCharType="separate"/>
+            </w:r>
+            <w:r>
+              <w:rPr>
+                <w:noProof/>
+                <w:webHidden/>
+              </w:rPr>
+              <w:t>2</w:t>
+            </w:r>
+            <w:r>
+              <w:rPr>
+                <w:noProof/>
+                <w:webHidden/>
+              </w:rPr>
+              <w:fldChar w:fldCharType="end"/>
+            </w:r>
+          </w:hyperlink>
         </w:p>
         <w:p>
           <w:pPr>
@@ -1707,6 +1660,16 @@
     <w:p/>
     <w:p/>
     <w:p/>
+    <w:p/>
+    <w:p/>
+    <w:p/>
+    <w:p/>
+    <w:p/>
+    <w:p/>
+    <w:p/>
+    <w:p/>
+    <w:p/>
+    <w:p/>
     <w:p>
       <w:pPr>
         <w:pStyle w:val="Ttulo1"/>
@@ -1721,7 +1684,7 @@
           <w:lang w:val="es-SV"/>
         </w:rPr>
       </w:pPr>
-      <w:bookmarkStart w:id="2" w:name="_Toc224899159"/>
+      <w:bookmarkStart w:id="1" w:name="_Toc224899159"/>
       <w:r>
         <w:rPr>
           <w:rFonts w:ascii="Arial" w:hAnsi="Arial" w:cs="Arial"/>
@@ -1732,8 +1695,190 @@
           <w:szCs w:val="24"/>
           <w:lang w:val="es-SV"/>
         </w:rPr>
+        <w:lastRenderedPageBreak/>
         <w:t>Arquitectura Propuesta</w:t>
       </w:r>
+      <w:bookmarkEnd w:id="1"/>
+    </w:p>
+    <w:p>
+      <w:pPr>
+        <w:rPr>
+          <w:rFonts w:ascii="Arial" w:hAnsi="Arial" w:cs="Arial"/>
+          <w:lang w:val="es-ES"/>
+        </w:rPr>
+      </w:pPr>
+      <w:r>
+        <w:rPr>
+          <w:rFonts w:ascii="Arial" w:hAnsi="Arial" w:cs="Arial"/>
+          <w:lang w:val="es-ES"/>
+        </w:rPr>
+        <w:t xml:space="preserve">La arquitectura del proyecto se basará en un modelo de 3 capas, </w:t>
+      </w:r>
+      <w:r>
+        <w:rPr>
+          <w:rFonts w:ascii="Arial" w:hAnsi="Arial" w:cs="Arial"/>
+          <w:lang w:val="es-SV"/>
+        </w:rPr>
+        <w:t>el cual organiza el sistema en componentes, tales como</w:t>
+      </w:r>
+      <w:r>
+        <w:rPr>
+          <w:rFonts w:ascii="Arial" w:hAnsi="Arial" w:cs="Arial"/>
+          <w:lang w:val="es-ES"/>
+        </w:rPr>
+        <w:t xml:space="preserve">: la interfaz gráfica del usuario, los servicios que se pueden realizar y las bases de datos que se utilizaran en el proyecto. </w:t>
+      </w:r>
+    </w:p>
+    <w:p>
+      <w:pPr>
+        <w:rPr>
+          <w:rFonts w:ascii="Arial" w:hAnsi="Arial" w:cs="Arial"/>
+          <w:lang w:val="es-ES"/>
+        </w:rPr>
+      </w:pPr>
+      <w:r>
+        <w:rPr>
+          <w:rFonts w:ascii="Arial" w:hAnsi="Arial" w:cs="Arial"/>
+          <w:lang w:val="es-ES"/>
+        </w:rPr>
+        <w:t xml:space="preserve">Se ha optado dividir el proyecto en estas capas porque esto permite un buen control sobre las distintas partes esenciales del proyecto, lo cual ayuda a dividir a este en partes más pequeñas y manejables. Las 3 capas incluyen partes distintas del proyecto, pero todas funcionan juntas para lograr que el sitio web pueda funcionar de una manera eficiente y correcta. Esta división también permite el mantenimiento, seguridad y escalabilidad de nuestro sitio web. </w:t>
+      </w:r>
+    </w:p>
+    <w:p>
+      <w:pPr>
+        <w:rPr>
+          <w:rFonts w:ascii="Arial" w:hAnsi="Arial" w:cs="Arial"/>
+          <w:lang w:val="es-ES"/>
+        </w:rPr>
+      </w:pPr>
+      <w:r>
+        <w:rPr>
+          <w:rFonts w:ascii="Arial" w:hAnsi="Arial" w:cs="Arial"/>
+          <w:lang w:val="es-ES"/>
+        </w:rPr>
+        <w:t xml:space="preserve">Al poder trabajar y enfocarse en que cada una de las capas funcione correctamente, podemos luego integrar las 3 para asegurar el funcionamiento correcto del sitio web. </w:t>
+      </w:r>
+    </w:p>
+    <w:p>
+      <w:pPr>
+        <w:rPr>
+          <w:rFonts w:ascii="Arial" w:hAnsi="Arial" w:cs="Arial"/>
+          <w:lang w:val="es-ES"/>
+        </w:rPr>
+      </w:pPr>
+      <w:r>
+        <w:rPr>
+          <w:rFonts w:ascii="Arial" w:hAnsi="Arial" w:cs="Arial"/>
+          <w:lang w:val="es-ES"/>
+        </w:rPr>
+        <w:t>Las 3 capas son:</w:t>
+      </w:r>
+    </w:p>
+    <w:p>
+      <w:pPr>
+        <w:pStyle w:val="Prrafodelista"/>
+        <w:numPr>
+          <w:ilvl w:val="0"/>
+          <w:numId w:val="13"/>
+        </w:numPr>
+        <w:rPr>
+          <w:rFonts w:ascii="Arial" w:hAnsi="Arial" w:cs="Arial"/>
+          <w:lang w:val="es-ES"/>
+        </w:rPr>
+      </w:pPr>
+      <w:r>
+        <w:rPr>
+          <w:rFonts w:ascii="Arial" w:hAnsi="Arial" w:cs="Arial"/>
+          <w:lang w:val="es-ES"/>
+        </w:rPr>
+        <w:t>Capa de Presentación (UI)</w:t>
+      </w:r>
+    </w:p>
+    <w:p>
+      <w:pPr>
+        <w:pStyle w:val="Prrafodelista"/>
+        <w:numPr>
+          <w:ilvl w:val="0"/>
+          <w:numId w:val="13"/>
+        </w:numPr>
+        <w:rPr>
+          <w:rFonts w:ascii="Arial" w:hAnsi="Arial" w:cs="Arial"/>
+          <w:lang w:val="es-ES"/>
+        </w:rPr>
+      </w:pPr>
+      <w:r>
+        <w:rPr>
+          <w:rFonts w:ascii="Arial" w:hAnsi="Arial" w:cs="Arial"/>
+          <w:lang w:val="es-ES"/>
+        </w:rPr>
+        <w:t>Capa Lógica</w:t>
+      </w:r>
+    </w:p>
+    <w:p>
+      <w:pPr>
+        <w:pStyle w:val="Prrafodelista"/>
+        <w:numPr>
+          <w:ilvl w:val="0"/>
+          <w:numId w:val="13"/>
+        </w:numPr>
+        <w:rPr>
+          <w:rFonts w:ascii="Arial" w:hAnsi="Arial" w:cs="Arial"/>
+          <w:lang w:val="es-ES"/>
+        </w:rPr>
+      </w:pPr>
+      <w:r>
+        <w:rPr>
+          <w:rFonts w:ascii="Arial" w:hAnsi="Arial" w:cs="Arial"/>
+          <w:lang w:val="es-ES"/>
+        </w:rPr>
+        <w:t>Capa de Datos</w:t>
+      </w:r>
+    </w:p>
+    <w:p>
+      <w:pPr>
+        <w:rPr>
+          <w:rFonts w:ascii="Arial" w:hAnsi="Arial" w:cs="Arial"/>
+          <w:lang w:val="es-ES"/>
+        </w:rPr>
+      </w:pPr>
+      <w:r>
+        <w:rPr>
+          <w:rFonts w:ascii="Arial" w:hAnsi="Arial" w:cs="Arial"/>
+          <w:lang w:val="es-ES"/>
+        </w:rPr>
+        <w:t xml:space="preserve">A continuación, explicaremos la importancia de cada una de las capas y en que consiste cada una. </w:t>
+      </w:r>
+    </w:p>
+    <w:p>
+      <w:pPr>
+        <w:rPr>
+          <w:rFonts w:ascii="Arial" w:hAnsi="Arial" w:cs="Arial"/>
+          <w:lang w:val="es-ES"/>
+        </w:rPr>
+      </w:pPr>
+    </w:p>
+    <w:p>
+      <w:pPr>
+        <w:pStyle w:val="Ttulo2"/>
+        <w:rPr>
+          <w:rFonts w:ascii="Arial" w:hAnsi="Arial" w:cs="Arial"/>
+          <w:color w:val="auto"/>
+          <w:sz w:val="24"/>
+          <w:szCs w:val="24"/>
+          <w:lang w:val="es-SV"/>
+        </w:rPr>
+      </w:pPr>
+      <w:bookmarkStart w:id="2" w:name="_Toc227002991"/>
+      <w:r>
+        <w:rPr>
+          <w:rFonts w:ascii="Arial" w:hAnsi="Arial" w:cs="Arial"/>
+          <w:color w:val="auto"/>
+          <w:sz w:val="24"/>
+          <w:szCs w:val="24"/>
+          <w:lang w:val="es-SV"/>
+        </w:rPr>
+        <w:t>Capa de Presentación (UI)</w:t>
+      </w:r>
       <w:bookmarkEnd w:id="2"/>
     </w:p>
     <w:p>
@@ -1743,6 +1888,2814 @@
           <w:lang w:val="es-ES"/>
         </w:rPr>
       </w:pPr>
+      <w:r>
+        <w:rPr>
+          <w:rFonts w:ascii="Arial" w:hAnsi="Arial" w:cs="Arial"/>
+          <w:lang w:val="es-ES"/>
+        </w:rPr>
+        <w:t xml:space="preserve">Esta capa es la interfaz gráfica del usuario (UI), la cual se enfoca en la presentación de nuestro sitio web al usuario. En esta capa, nos enfocamos en diseñar como se verá el sitio web al usuario, al especificar y planear las distintas vistas a las cuales tendrán acceso los usuarios, al igual que los servicios que estas poseerán (aunque en esto se enfoca más la siguiente capa). </w:t>
+      </w:r>
+    </w:p>
+    <w:p>
+      <w:pPr>
+        <w:rPr>
+          <w:rFonts w:ascii="Arial" w:hAnsi="Arial" w:cs="Arial"/>
+          <w:lang w:val="es-ES"/>
+        </w:rPr>
+      </w:pPr>
+      <w:r>
+        <w:rPr>
+          <w:rFonts w:ascii="Arial" w:hAnsi="Arial" w:cs="Arial"/>
+          <w:lang w:val="es-ES"/>
+        </w:rPr>
+        <w:t xml:space="preserve">Es esencial de que se plantee bien esto, ya que es lo que permite que el usuario pueda acceder a los distintos servicios que ofreceremos y que esto también sea claro para facilitar el uso de nuestro sitio web a los usuarios. </w:t>
+      </w:r>
+    </w:p>
+    <w:p>
+      <w:pPr>
+        <w:rPr>
+          <w:rFonts w:ascii="Arial" w:hAnsi="Arial" w:cs="Arial"/>
+          <w:lang w:val="es-ES"/>
+        </w:rPr>
+      </w:pPr>
+      <w:r>
+        <w:rPr>
+          <w:rFonts w:ascii="Arial" w:hAnsi="Arial" w:cs="Arial"/>
+          <w:lang w:val="es-ES"/>
+        </w:rPr>
+        <w:t xml:space="preserve">Decidimos ocupar esta capa porque nos permite diseñar y separar las distintas vistas a las cuales tendrán acceso los usuarios y poder así tener un buen flujo, con el cual podemos asegurarnos de que los usuarios puedan moverse en todo el sitio web y a ocupar los servicios que estos necesiten. </w:t>
+      </w:r>
+    </w:p>
+    <w:p>
+      <w:pPr>
+        <w:rPr>
+          <w:rFonts w:ascii="Arial" w:hAnsi="Arial" w:cs="Arial"/>
+          <w:lang w:val="es-ES"/>
+        </w:rPr>
+      </w:pPr>
+      <w:r>
+        <w:rPr>
+          <w:rFonts w:ascii="Arial" w:hAnsi="Arial" w:cs="Arial"/>
+          <w:lang w:val="es-ES"/>
+        </w:rPr>
+        <w:t>Hemos dividido las distintas vistas de nuestro sitio en las siguientes páginas:</w:t>
+      </w:r>
+    </w:p>
+    <w:p>
+      <w:pPr>
+        <w:jc w:val="center"/>
+        <w:rPr>
+          <w:rFonts w:ascii="Arial" w:hAnsi="Arial" w:cs="Arial"/>
+          <w:lang w:val="es-ES"/>
+        </w:rPr>
+      </w:pPr>
+      <w:r>
+        <w:rPr>
+          <w:rFonts w:ascii="Arial" w:hAnsi="Arial" w:cs="Arial"/>
+          <w:lang w:val="es-ES"/>
+        </w:rPr>
+        <w:t>Página Login</w:t>
+      </w:r>
+    </w:p>
+    <w:p>
+      <w:pPr>
+        <w:rPr>
+          <w:rFonts w:ascii="Arial" w:hAnsi="Arial" w:cs="Arial"/>
+          <w:lang w:val="es-ES"/>
+        </w:rPr>
+      </w:pPr>
+      <w:r>
+        <w:rPr>
+          <w:rFonts w:ascii="Arial" w:hAnsi="Arial" w:cs="Arial"/>
+          <w:lang w:val="es-ES"/>
+        </w:rPr>
+        <w:lastRenderedPageBreak/>
+        <w:t xml:space="preserve">Esta es la página principal que verán todos los usuarios al ingresar por primera vez a nuestro sitio web. En ella, el usuario tendrá que poner su información (usuario y contraseña) para poder acceder a los distintos servicios que ofrece el sitio web. Esta página es importante porque, no solo provee seguridad al sitio web – al asegurarse de que solo los usuarios puedan acceder a la información privada – sino que también ayuda a filtrar los distintos servicios a los que tendrán acceso los distintos usuarios. </w:t>
+      </w:r>
+    </w:p>
+    <w:p>
+      <w:pPr>
+        <w:rPr>
+          <w:rFonts w:ascii="Arial" w:hAnsi="Arial" w:cs="Arial"/>
+          <w:lang w:val="es-ES"/>
+        </w:rPr>
+      </w:pPr>
+      <w:r>
+        <w:rPr>
+          <w:rFonts w:ascii="Arial" w:hAnsi="Arial" w:cs="Arial"/>
+          <w:lang w:val="es-ES"/>
+        </w:rPr>
+        <w:t xml:space="preserve">Ya que hemos dividido a los usuarios en 3 distintos tipos (empleado, jefe y administrador), cada uno de estos tienen permisos diferentes, los cuales les dan acceso especifico a los distintos servicios que ofrecemos en nuestro sitio. Esta página </w:t>
+      </w:r>
+      <w:r>
+        <w:rPr>
+          <w:rFonts w:ascii="Arial" w:hAnsi="Arial" w:cs="Arial"/>
+          <w:lang w:val="es-ES"/>
+        </w:rPr>
+        <w:t>redireccionará</w:t>
+      </w:r>
+      <w:r>
+        <w:rPr>
+          <w:rFonts w:ascii="Arial" w:hAnsi="Arial" w:cs="Arial"/>
+          <w:lang w:val="es-ES"/>
+        </w:rPr>
+        <w:t xml:space="preserve"> </w:t>
+      </w:r>
+      <w:r>
+        <w:rPr>
+          <w:rFonts w:ascii="Arial" w:hAnsi="Arial" w:cs="Arial"/>
+          <w:lang w:val="es-ES"/>
+        </w:rPr>
+        <w:t xml:space="preserve">a los distintos empleados a los menús principales para cada uno de los usuarios específicos. </w:t>
+      </w:r>
+    </w:p>
+    <w:p>
+      <w:pPr>
+        <w:rPr>
+          <w:rFonts w:ascii="Arial" w:hAnsi="Arial" w:cs="Arial"/>
+          <w:lang w:val="es-ES"/>
+        </w:rPr>
+      </w:pPr>
+    </w:p>
+    <w:p>
+      <w:pPr>
+        <w:jc w:val="center"/>
+        <w:rPr>
+          <w:rFonts w:ascii="Arial" w:hAnsi="Arial" w:cs="Arial"/>
+          <w:lang w:val="es-ES"/>
+        </w:rPr>
+      </w:pPr>
+      <w:r>
+        <w:rPr>
+          <w:rFonts w:ascii="Arial" w:hAnsi="Arial" w:cs="Arial"/>
+          <w:lang w:val="es-ES"/>
+        </w:rPr>
+        <w:t>Menu principal (empleados, jefes y administradores)</w:t>
+      </w:r>
+    </w:p>
+    <w:p>
+      <w:pPr>
+        <w:rPr>
+          <w:rFonts w:ascii="Arial" w:hAnsi="Arial" w:cs="Arial"/>
+          <w:lang w:val="es-ES"/>
+        </w:rPr>
+      </w:pPr>
+      <w:r>
+        <w:rPr>
+          <w:rFonts w:ascii="Arial" w:hAnsi="Arial" w:cs="Arial"/>
+          <w:lang w:val="es-ES"/>
+        </w:rPr>
+        <w:t xml:space="preserve">Estas páginas serán 3 menús distintos, uno específico para el rol de cada empleado. Es en estos donde el usuario tendrá la opción de acceder a las otras páginas distintas donde están los servicios disponibles a ellos. </w:t>
+      </w:r>
+    </w:p>
+    <w:p>
+      <w:pPr>
+        <w:rPr>
+          <w:rFonts w:ascii="Arial" w:hAnsi="Arial" w:cs="Arial"/>
+          <w:lang w:val="es-ES"/>
+        </w:rPr>
+      </w:pPr>
+      <w:r>
+        <w:rPr>
+          <w:rFonts w:ascii="Arial" w:hAnsi="Arial" w:cs="Arial"/>
+          <w:lang w:val="es-ES"/>
+        </w:rPr>
+        <w:t xml:space="preserve"> Esta página es de suma importancia, ya que es la que permitirá que cada usuario (dependiendo de su rol) pueda acceder a las otras páginas, esta será la manera principal de desplazarse por todo el sitio web. </w:t>
+      </w:r>
+    </w:p>
+    <w:p>
+      <w:pPr>
+        <w:rPr>
+          <w:rFonts w:ascii="Arial" w:hAnsi="Arial" w:cs="Arial"/>
+          <w:lang w:val="es-ES"/>
+        </w:rPr>
+      </w:pPr>
+      <w:r>
+        <w:rPr>
+          <w:rFonts w:ascii="Arial" w:hAnsi="Arial" w:cs="Arial"/>
+          <w:lang w:val="es-ES"/>
+        </w:rPr>
+        <w:t>Ya que cada usuario tiene un rol especifico, las paginas tendrán opciones distintas dependiendo de esto, y se dividirán en la siguiente manera:</w:t>
+      </w:r>
+    </w:p>
+    <w:p>
+      <w:pPr>
+        <w:pStyle w:val="Prrafodelista"/>
+        <w:numPr>
+          <w:ilvl w:val="0"/>
+          <w:numId w:val="14"/>
+        </w:numPr>
+        <w:rPr>
+          <w:rFonts w:ascii="Arial" w:hAnsi="Arial" w:cs="Arial"/>
+          <w:lang w:val="es-ES"/>
+        </w:rPr>
+      </w:pPr>
+      <w:r>
+        <w:rPr>
+          <w:rFonts w:ascii="Arial" w:hAnsi="Arial" w:cs="Arial"/>
+          <w:lang w:val="es-ES"/>
+        </w:rPr>
+        <w:t>Todos los usuarios</w:t>
+      </w:r>
+    </w:p>
+    <w:p>
+      <w:pPr>
+        <w:pStyle w:val="Prrafodelista"/>
+        <w:numPr>
+          <w:ilvl w:val="1"/>
+          <w:numId w:val="14"/>
+        </w:numPr>
+        <w:rPr>
+          <w:rFonts w:ascii="Arial" w:hAnsi="Arial" w:cs="Arial"/>
+          <w:lang w:val="es-ES"/>
+        </w:rPr>
+      </w:pPr>
+      <w:r>
+        <w:rPr>
+          <w:rFonts w:ascii="Arial" w:hAnsi="Arial" w:cs="Arial"/>
+          <w:lang w:val="es-ES"/>
+        </w:rPr>
+        <w:t xml:space="preserve">Tendrán la opción de hacer logout para regresar a la página de login, y de esta forma, proteger la información privada de la empresa. </w:t>
+      </w:r>
+    </w:p>
+    <w:p>
+      <w:pPr>
+        <w:pStyle w:val="Prrafodelista"/>
+        <w:numPr>
+          <w:ilvl w:val="1"/>
+          <w:numId w:val="14"/>
+        </w:numPr>
+        <w:rPr>
+          <w:rFonts w:ascii="Arial" w:hAnsi="Arial" w:cs="Arial"/>
+          <w:lang w:val="es-ES"/>
+        </w:rPr>
+      </w:pPr>
+      <w:r>
+        <w:rPr>
+          <w:rFonts w:ascii="Arial" w:hAnsi="Arial" w:cs="Arial"/>
+          <w:lang w:val="es-ES"/>
+        </w:rPr>
+        <w:t xml:space="preserve">Tendrán la opción de ir a la página de subir documentos al sitio web. </w:t>
+      </w:r>
+    </w:p>
+    <w:p>
+      <w:pPr>
+        <w:pStyle w:val="Prrafodelista"/>
+        <w:numPr>
+          <w:ilvl w:val="0"/>
+          <w:numId w:val="14"/>
+        </w:numPr>
+        <w:rPr>
+          <w:rFonts w:ascii="Arial" w:hAnsi="Arial" w:cs="Arial"/>
+          <w:lang w:val="es-ES"/>
+        </w:rPr>
+      </w:pPr>
+      <w:r>
+        <w:rPr>
+          <w:rFonts w:ascii="Arial" w:hAnsi="Arial" w:cs="Arial"/>
+          <w:lang w:val="es-ES"/>
+        </w:rPr>
+        <w:t>Empleados</w:t>
+      </w:r>
+    </w:p>
+    <w:p>
+      <w:pPr>
+        <w:pStyle w:val="Prrafodelista"/>
+        <w:numPr>
+          <w:ilvl w:val="1"/>
+          <w:numId w:val="14"/>
+        </w:numPr>
+        <w:rPr>
+          <w:rFonts w:ascii="Arial" w:hAnsi="Arial" w:cs="Arial"/>
+          <w:lang w:val="es-ES"/>
+        </w:rPr>
+      </w:pPr>
+      <w:r>
+        <w:rPr>
+          <w:rFonts w:ascii="Arial" w:hAnsi="Arial" w:cs="Arial"/>
+          <w:lang w:val="es-ES"/>
+        </w:rPr>
+        <w:t xml:space="preserve">Los empleados tendrán la opción de ir a otra página donde se pueden ver todos los documentos que ellos han subido. </w:t>
+      </w:r>
+    </w:p>
+    <w:p>
+      <w:pPr>
+        <w:pStyle w:val="Prrafodelista"/>
+        <w:numPr>
+          <w:ilvl w:val="1"/>
+          <w:numId w:val="14"/>
+        </w:numPr>
+        <w:rPr>
+          <w:rFonts w:ascii="Arial" w:hAnsi="Arial" w:cs="Arial"/>
+          <w:lang w:val="es-ES"/>
+        </w:rPr>
+      </w:pPr>
+      <w:r>
+        <w:rPr>
+          <w:rFonts w:ascii="Arial" w:hAnsi="Arial" w:cs="Arial"/>
+          <w:lang w:val="es-ES"/>
+        </w:rPr>
+        <w:t xml:space="preserve">Los empleados tendrán la opción de ir a otra página donde se podrá ver el versionado de los documentos que ellos han subido. </w:t>
+      </w:r>
+    </w:p>
+    <w:p>
+      <w:pPr>
+        <w:pStyle w:val="Prrafodelista"/>
+        <w:numPr>
+          <w:ilvl w:val="1"/>
+          <w:numId w:val="14"/>
+        </w:numPr>
+        <w:rPr>
+          <w:rFonts w:ascii="Arial" w:hAnsi="Arial" w:cs="Arial"/>
+          <w:lang w:val="es-ES"/>
+        </w:rPr>
+      </w:pPr>
+      <w:r>
+        <w:rPr>
+          <w:rFonts w:ascii="Arial" w:hAnsi="Arial" w:cs="Arial"/>
+          <w:lang w:val="es-ES"/>
+        </w:rPr>
+        <w:t xml:space="preserve">Los empleados tendrán la opción de ir a una página donde ellos podrán subir nuevos documentos para que estos sean aprobados. </w:t>
+      </w:r>
+    </w:p>
+    <w:p>
+      <w:pPr>
+        <w:pStyle w:val="Prrafodelista"/>
+        <w:numPr>
+          <w:ilvl w:val="1"/>
+          <w:numId w:val="14"/>
+        </w:numPr>
+        <w:rPr>
+          <w:rFonts w:ascii="Arial" w:hAnsi="Arial" w:cs="Arial"/>
+          <w:lang w:val="es-ES"/>
+        </w:rPr>
+      </w:pPr>
+      <w:r>
+        <w:rPr>
+          <w:rFonts w:ascii="Arial" w:hAnsi="Arial" w:cs="Arial"/>
+          <w:lang w:val="es-ES"/>
+        </w:rPr>
+        <w:t xml:space="preserve">Los empleados tendrán la opción de ir a una página donde ellos podrán subir una nueva versión de un documento para que esta sea aprobada. </w:t>
+      </w:r>
+    </w:p>
+    <w:p>
+      <w:pPr>
+        <w:pStyle w:val="Prrafodelista"/>
+        <w:ind w:left="1440"/>
+        <w:rPr>
+          <w:rFonts w:ascii="Arial" w:hAnsi="Arial" w:cs="Arial"/>
+          <w:lang w:val="es-ES"/>
+        </w:rPr>
+      </w:pPr>
+    </w:p>
+    <w:p>
+      <w:pPr>
+        <w:pStyle w:val="Prrafodelista"/>
+        <w:numPr>
+          <w:ilvl w:val="0"/>
+          <w:numId w:val="14"/>
+        </w:numPr>
+        <w:rPr>
+          <w:rFonts w:ascii="Arial" w:hAnsi="Arial" w:cs="Arial"/>
+          <w:lang w:val="es-ES"/>
+        </w:rPr>
+      </w:pPr>
+      <w:r>
+        <w:rPr>
+          <w:rFonts w:ascii="Arial" w:hAnsi="Arial" w:cs="Arial"/>
+          <w:lang w:val="es-ES"/>
+        </w:rPr>
+        <w:t>Jefes</w:t>
+      </w:r>
+    </w:p>
+    <w:p>
+      <w:pPr>
+        <w:pStyle w:val="Prrafodelista"/>
+        <w:numPr>
+          <w:ilvl w:val="1"/>
+          <w:numId w:val="14"/>
+        </w:numPr>
+        <w:rPr>
+          <w:rFonts w:ascii="Arial" w:hAnsi="Arial" w:cs="Arial"/>
+          <w:lang w:val="es-ES"/>
+        </w:rPr>
+      </w:pPr>
+      <w:r>
+        <w:rPr>
+          <w:rFonts w:ascii="Arial" w:hAnsi="Arial" w:cs="Arial"/>
+          <w:lang w:val="es-ES"/>
+        </w:rPr>
+        <w:lastRenderedPageBreak/>
+        <w:t xml:space="preserve">Los jefes tendrán la opción de ir a una página donde se pueden ver todos </w:t>
+      </w:r>
+      <w:r>
+        <w:rPr>
+          <w:rFonts w:ascii="Arial" w:hAnsi="Arial" w:cs="Arial"/>
+          <w:lang w:val="es-ES"/>
+        </w:rPr>
+        <w:t xml:space="preserve">los documentos que han subido los empleados. </w:t>
+      </w:r>
+    </w:p>
+    <w:p>
+      <w:pPr>
+        <w:pStyle w:val="Prrafodelista"/>
+        <w:numPr>
+          <w:ilvl w:val="1"/>
+          <w:numId w:val="14"/>
+        </w:numPr>
+        <w:rPr>
+          <w:rFonts w:ascii="Arial" w:hAnsi="Arial" w:cs="Arial"/>
+          <w:lang w:val="es-ES"/>
+        </w:rPr>
+      </w:pPr>
+      <w:r>
+        <w:rPr>
+          <w:rFonts w:ascii="Arial" w:hAnsi="Arial" w:cs="Arial"/>
+          <w:lang w:val="es-ES"/>
+        </w:rPr>
+        <w:t xml:space="preserve">Los jefes tendrán la opción de ir a otra página donde se pueden ver las distintas versiones de los documentos que han subido todos los empleados. </w:t>
+      </w:r>
+    </w:p>
+    <w:p>
+      <w:pPr>
+        <w:pStyle w:val="Prrafodelista"/>
+        <w:numPr>
+          <w:ilvl w:val="1"/>
+          <w:numId w:val="14"/>
+        </w:numPr>
+        <w:rPr>
+          <w:rFonts w:ascii="Arial" w:hAnsi="Arial" w:cs="Arial"/>
+          <w:lang w:val="es-ES"/>
+        </w:rPr>
+      </w:pPr>
+      <w:r>
+        <w:rPr>
+          <w:rFonts w:ascii="Arial" w:hAnsi="Arial" w:cs="Arial"/>
+          <w:lang w:val="es-ES"/>
+        </w:rPr>
+        <w:t xml:space="preserve">Los jefes podrán ir a una página donde podrá aprobar o rechazar los documentos que han subido los empleados. </w:t>
+      </w:r>
+    </w:p>
+    <w:p>
+      <w:pPr>
+        <w:pStyle w:val="Prrafodelista"/>
+        <w:numPr>
+          <w:ilvl w:val="0"/>
+          <w:numId w:val="14"/>
+        </w:numPr>
+        <w:rPr>
+          <w:rFonts w:ascii="Arial" w:hAnsi="Arial" w:cs="Arial"/>
+          <w:lang w:val="es-ES"/>
+        </w:rPr>
+      </w:pPr>
+      <w:r>
+        <w:rPr>
+          <w:rFonts w:ascii="Arial" w:hAnsi="Arial" w:cs="Arial"/>
+          <w:lang w:val="es-ES"/>
+        </w:rPr>
+        <w:t>Administradores</w:t>
+      </w:r>
+    </w:p>
+    <w:p>
+      <w:pPr>
+        <w:pStyle w:val="Prrafodelista"/>
+        <w:numPr>
+          <w:ilvl w:val="1"/>
+          <w:numId w:val="14"/>
+        </w:numPr>
+        <w:rPr>
+          <w:rFonts w:ascii="Arial" w:hAnsi="Arial" w:cs="Arial"/>
+          <w:lang w:val="es-ES"/>
+        </w:rPr>
+      </w:pPr>
+      <w:r>
+        <w:rPr>
+          <w:rFonts w:ascii="Arial" w:hAnsi="Arial" w:cs="Arial"/>
+          <w:lang w:val="es-ES"/>
+        </w:rPr>
+        <w:t xml:space="preserve">Los administradores tendrán la opción de ir a una página donde se pueden ver todos los documentos que han subido los empleados. </w:t>
+      </w:r>
+    </w:p>
+    <w:p>
+      <w:pPr>
+        <w:pStyle w:val="Prrafodelista"/>
+        <w:numPr>
+          <w:ilvl w:val="1"/>
+          <w:numId w:val="14"/>
+        </w:numPr>
+        <w:rPr>
+          <w:rFonts w:ascii="Arial" w:hAnsi="Arial" w:cs="Arial"/>
+          <w:lang w:val="es-ES"/>
+        </w:rPr>
+      </w:pPr>
+      <w:r>
+        <w:rPr>
+          <w:rFonts w:ascii="Arial" w:hAnsi="Arial" w:cs="Arial"/>
+          <w:lang w:val="es-ES"/>
+        </w:rPr>
+        <w:t xml:space="preserve">Los administradores tendrán la opción de ir a otra página donde se pueden ver las distintas versiones de los documentos que han subido todos los empleados. </w:t>
+      </w:r>
+    </w:p>
+    <w:p>
+      <w:pPr>
+        <w:pStyle w:val="Prrafodelista"/>
+        <w:numPr>
+          <w:ilvl w:val="1"/>
+          <w:numId w:val="14"/>
+        </w:numPr>
+        <w:rPr>
+          <w:rFonts w:ascii="Arial" w:hAnsi="Arial" w:cs="Arial"/>
+          <w:lang w:val="es-ES"/>
+        </w:rPr>
+      </w:pPr>
+      <w:r>
+        <w:rPr>
+          <w:rFonts w:ascii="Arial" w:hAnsi="Arial" w:cs="Arial"/>
+          <w:lang w:val="es-ES"/>
+        </w:rPr>
+        <w:t xml:space="preserve">Los administradores podrán ir a una página donde podrá aprobar o rechazar los documentos que han subido los empleados. </w:t>
+      </w:r>
+    </w:p>
+    <w:p>
+      <w:pPr>
+        <w:pStyle w:val="Prrafodelista"/>
+        <w:numPr>
+          <w:ilvl w:val="1"/>
+          <w:numId w:val="14"/>
+        </w:numPr>
+        <w:rPr>
+          <w:rFonts w:ascii="Arial" w:hAnsi="Arial" w:cs="Arial"/>
+          <w:lang w:val="es-ES"/>
+        </w:rPr>
+      </w:pPr>
+      <w:r>
+        <w:rPr>
+          <w:rFonts w:ascii="Arial" w:hAnsi="Arial" w:cs="Arial"/>
+          <w:lang w:val="es-ES"/>
+        </w:rPr>
+        <w:t xml:space="preserve">Los administradores podrán ir a otra página donde podrán agregar a nuevos usuarios y asignarles sus roles. </w:t>
+      </w:r>
+    </w:p>
+    <w:p>
+      <w:pPr>
+        <w:rPr>
+          <w:rFonts w:ascii="Arial" w:hAnsi="Arial" w:cs="Arial"/>
+          <w:lang w:val="es-ES"/>
+        </w:rPr>
+      </w:pPr>
+    </w:p>
+    <w:p>
+      <w:pPr>
+        <w:jc w:val="center"/>
+        <w:rPr>
+          <w:rFonts w:ascii="Arial" w:hAnsi="Arial" w:cs="Arial"/>
+          <w:lang w:val="es-ES"/>
+        </w:rPr>
+      </w:pPr>
+      <w:r>
+        <w:rPr>
+          <w:rFonts w:ascii="Arial" w:hAnsi="Arial" w:cs="Arial"/>
+          <w:lang w:val="es-ES"/>
+        </w:rPr>
+        <w:t>Página para ver los documentos</w:t>
+      </w:r>
+    </w:p>
+    <w:p>
+      <w:pPr>
+        <w:rPr>
+          <w:rFonts w:ascii="Arial" w:hAnsi="Arial" w:cs="Arial"/>
+          <w:lang w:val="es-ES"/>
+        </w:rPr>
+      </w:pPr>
+      <w:r>
+        <w:rPr>
+          <w:rFonts w:ascii="Arial" w:hAnsi="Arial" w:cs="Arial"/>
+          <w:lang w:val="es-ES"/>
+        </w:rPr>
+        <w:t xml:space="preserve">Esta página es la que permitirá que todos los usuarios puedan ver los distintos documentos que ellos han subido y está dividida en dos categorías distintas. </w:t>
+      </w:r>
+    </w:p>
+    <w:p>
+      <w:pPr>
+        <w:rPr>
+          <w:rFonts w:ascii="Arial" w:hAnsi="Arial" w:cs="Arial"/>
+          <w:lang w:val="es-ES"/>
+        </w:rPr>
+      </w:pPr>
+      <w:r>
+        <w:rPr>
+          <w:rFonts w:ascii="Arial" w:hAnsi="Arial" w:cs="Arial"/>
+          <w:lang w:val="es-ES"/>
+        </w:rPr>
+        <w:t xml:space="preserve">Los empleados podrán solo ver los documentos que ellos han subido, al igual que la información necesaria de estos (como si fueron aprobados o rechazados, poder visualizar el documento y ver los comentarios). </w:t>
+      </w:r>
+    </w:p>
+    <w:p>
+      <w:pPr>
+        <w:rPr>
+          <w:rFonts w:ascii="Arial" w:hAnsi="Arial" w:cs="Arial"/>
+          <w:lang w:val="es-ES"/>
+        </w:rPr>
+      </w:pPr>
+      <w:r>
+        <w:rPr>
+          <w:rFonts w:ascii="Arial" w:hAnsi="Arial" w:cs="Arial"/>
+          <w:lang w:val="es-ES"/>
+        </w:rPr>
+        <w:t xml:space="preserve">Los jefes y administradores podrán ver todos los documentos que los empleados han subido al igual que la información necesaria de estos (como se muestran en el párrafo anterior). </w:t>
+      </w:r>
+    </w:p>
+    <w:p>
+      <w:pPr>
+        <w:rPr>
+          <w:rFonts w:ascii="Arial" w:hAnsi="Arial" w:cs="Arial"/>
+          <w:lang w:val="es-ES"/>
+        </w:rPr>
+      </w:pPr>
+      <w:r>
+        <w:rPr>
+          <w:rFonts w:ascii="Arial" w:hAnsi="Arial" w:cs="Arial"/>
+          <w:lang w:val="es-ES"/>
+        </w:rPr>
+        <w:t xml:space="preserve">Esta es la página más importante de nuestro sitio web, ya que es la que permite que se centralicen todos los documentos de la empresa en un mismo sitio (guardándose en la base de datos) para que se puedan acceder a ellos y que un usuario se pueda asegurar de que está ocupando la última versión aprobada por un jefe. También se puede ver en esta los cambios que se han hecho al documento, quien lo ha subido, quien lo aprobó y las fechas donde esto se hizo. </w:t>
+      </w:r>
+    </w:p>
+    <w:p>
+      <w:pPr>
+        <w:rPr>
+          <w:rFonts w:ascii="Arial" w:hAnsi="Arial" w:cs="Arial"/>
+          <w:lang w:val="es-ES"/>
+        </w:rPr>
+      </w:pPr>
+    </w:p>
+    <w:p>
+      <w:pPr>
+        <w:rPr>
+          <w:rFonts w:ascii="Arial" w:hAnsi="Arial" w:cs="Arial"/>
+          <w:lang w:val="es-ES"/>
+        </w:rPr>
+      </w:pPr>
+    </w:p>
+    <w:p>
+      <w:pPr>
+        <w:jc w:val="center"/>
+        <w:rPr>
+          <w:rFonts w:ascii="Arial" w:hAnsi="Arial" w:cs="Arial"/>
+          <w:lang w:val="es-ES"/>
+        </w:rPr>
+      </w:pPr>
+      <w:r>
+        <w:rPr>
+          <w:rFonts w:ascii="Arial" w:hAnsi="Arial" w:cs="Arial"/>
+          <w:lang w:val="es-ES"/>
+        </w:rPr>
+        <w:t>Página para ver el versionado de un documento</w:t>
+      </w:r>
+    </w:p>
+    <w:p>
+      <w:pPr>
+        <w:rPr>
+          <w:rFonts w:ascii="Arial" w:hAnsi="Arial" w:cs="Arial"/>
+          <w:lang w:val="es-ES"/>
+        </w:rPr>
+      </w:pPr>
+      <w:r>
+        <w:rPr>
+          <w:rFonts w:ascii="Arial" w:hAnsi="Arial" w:cs="Arial"/>
+          <w:lang w:val="es-ES"/>
+        </w:rPr>
+        <w:lastRenderedPageBreak/>
+        <w:t>Esta página permite ver todas las versiones anteriores de un documento especifico, lo que permite que los usuarios puedan revisar documentos anteriores. También permite que se vean las versiones que fueron rechazadas y las versiones que fueron aceptadas por los jefes o administradores, lo que facilita la búsqueda de documentos.</w:t>
+      </w:r>
+    </w:p>
+    <w:p>
+      <w:pPr>
+        <w:rPr>
+          <w:rFonts w:ascii="Arial" w:hAnsi="Arial" w:cs="Arial"/>
+          <w:lang w:val="es-ES"/>
+        </w:rPr>
+      </w:pPr>
+      <w:r>
+        <w:rPr>
+          <w:rFonts w:ascii="Arial" w:hAnsi="Arial" w:cs="Arial"/>
+          <w:lang w:val="es-ES"/>
+        </w:rPr>
+        <w:t>Esta página es de gran importancia ya que permite la funcionalidad de revisar los documentos viejos (por si alguien quiere revisar los cambios que se hicieron entre estos) y muestra cuales son los documentos que fueron aprobados, para poder así enfocarse en ellos y reducir los errores de elegir un documento equivocado. En esta se pueden ver todos los cambios que se han hecho al documento, quien lo ha subido, quien lo aprobó y las fechas donde esto se hizo.</w:t>
+      </w:r>
+    </w:p>
+    <w:p>
+      <w:pPr>
+        <w:rPr>
+          <w:rFonts w:ascii="Arial" w:hAnsi="Arial" w:cs="Arial"/>
+          <w:lang w:val="es-ES"/>
+        </w:rPr>
+      </w:pPr>
+    </w:p>
+    <w:p>
+      <w:pPr>
+        <w:jc w:val="center"/>
+        <w:rPr>
+          <w:rFonts w:ascii="Arial" w:hAnsi="Arial" w:cs="Arial"/>
+          <w:lang w:val="es-ES"/>
+        </w:rPr>
+      </w:pPr>
+      <w:r>
+        <w:rPr>
+          <w:rFonts w:ascii="Arial" w:hAnsi="Arial" w:cs="Arial"/>
+          <w:lang w:val="es-ES"/>
+        </w:rPr>
+        <w:t>Página para subir un nuevo documento</w:t>
+      </w:r>
+    </w:p>
+    <w:p>
+      <w:pPr>
+        <w:rPr>
+          <w:rFonts w:ascii="Arial" w:hAnsi="Arial" w:cs="Arial"/>
+          <w:lang w:val="es-ES"/>
+        </w:rPr>
+      </w:pPr>
+      <w:r>
+        <w:rPr>
+          <w:rFonts w:ascii="Arial" w:hAnsi="Arial" w:cs="Arial"/>
+          <w:lang w:val="es-ES"/>
+        </w:rPr>
+        <w:t xml:space="preserve">Todos los usuarios tienen acceso a esta página y es la que permite que estos puedan subir los documentos al sitio web centralizado. Esta página permite que se pueda subir un nuevo documento y crea la propia categoría del documento, si este es aprobado, para que puedan tener acceso los usuarios. </w:t>
+      </w:r>
+    </w:p>
+    <w:p>
+      <w:pPr>
+        <w:rPr>
+          <w:rFonts w:ascii="Arial" w:hAnsi="Arial" w:cs="Arial"/>
+          <w:lang w:val="es-ES"/>
+        </w:rPr>
+      </w:pPr>
+      <w:r>
+        <w:rPr>
+          <w:rFonts w:ascii="Arial" w:hAnsi="Arial" w:cs="Arial"/>
+          <w:lang w:val="es-ES"/>
+        </w:rPr>
+        <w:t xml:space="preserve">Decidimos crear esta pagina (separada a la de subir una nueva versión del documento) para simplificar el proceso de subir documentos. Esta es de gran importancia porque permite que se pueda subir un nuevo documento, y si es aceptado, que se cree una nueva categoría para este, en la cual se pueden nuevo subir nuevas versiones de este mismo documento. </w:t>
+      </w:r>
+    </w:p>
+    <w:p>
+      <w:pPr>
+        <w:jc w:val="center"/>
+        <w:rPr>
+          <w:rFonts w:ascii="Arial" w:hAnsi="Arial" w:cs="Arial"/>
+          <w:lang w:val="es-ES"/>
+        </w:rPr>
+      </w:pPr>
+    </w:p>
+    <w:p>
+      <w:pPr>
+        <w:jc w:val="center"/>
+        <w:rPr>
+          <w:rFonts w:ascii="Arial" w:hAnsi="Arial" w:cs="Arial"/>
+          <w:lang w:val="es-ES"/>
+        </w:rPr>
+      </w:pPr>
+      <w:r>
+        <w:rPr>
+          <w:rFonts w:ascii="Arial" w:hAnsi="Arial" w:cs="Arial"/>
+          <w:lang w:val="es-ES"/>
+        </w:rPr>
+        <w:t>Página para subir una nueva versión de un documento</w:t>
+      </w:r>
+    </w:p>
+    <w:p>
+      <w:pPr>
+        <w:rPr>
+          <w:rFonts w:ascii="Arial" w:hAnsi="Arial" w:cs="Arial"/>
+          <w:lang w:val="es-ES"/>
+        </w:rPr>
+      </w:pPr>
+      <w:r>
+        <w:rPr>
+          <w:rFonts w:ascii="Arial" w:hAnsi="Arial" w:cs="Arial"/>
+          <w:lang w:val="es-ES"/>
+        </w:rPr>
+        <w:t xml:space="preserve">En esta página, se pueden subir nuevas versiones de un mismo documento, las cuales tendrán cambios a dicho documento. Esta permite que los usuarios puedan enfocarse en un mismo documento y poder así subir una versión mejorada o con cambios de este mismo documento. </w:t>
+      </w:r>
+    </w:p>
+    <w:p>
+      <w:pPr>
+        <w:rPr>
+          <w:rFonts w:ascii="Arial" w:hAnsi="Arial" w:cs="Arial"/>
+          <w:lang w:val="es-ES"/>
+        </w:rPr>
+      </w:pPr>
+      <w:r>
+        <w:rPr>
+          <w:rFonts w:ascii="Arial" w:hAnsi="Arial" w:cs="Arial"/>
+          <w:lang w:val="es-ES"/>
+        </w:rPr>
+        <w:t xml:space="preserve">Decidimos crear esta página por separado para simplificar el proceso y evitar errores al subir documentos. Al tener una página específica para subir una nueva versión de un documento, esto evita el problema de que uno pueda subir la nueva versión como un nuevo documento, lo cual afectaría al sistema ya que pudiera haber varios documentos que están como nuevos mientras que son versiones de otros ya existentes. </w:t>
+      </w:r>
+    </w:p>
+    <w:p>
+      <w:pPr>
+        <w:rPr>
+          <w:rFonts w:ascii="Arial" w:hAnsi="Arial" w:cs="Arial"/>
+          <w:lang w:val="es-ES"/>
+        </w:rPr>
+      </w:pPr>
+    </w:p>
+    <w:p>
+      <w:pPr>
+        <w:jc w:val="center"/>
+        <w:rPr>
+          <w:rFonts w:ascii="Arial" w:hAnsi="Arial" w:cs="Arial"/>
+          <w:lang w:val="es-ES"/>
+        </w:rPr>
+      </w:pPr>
+      <w:r>
+        <w:rPr>
+          <w:rFonts w:ascii="Arial" w:hAnsi="Arial" w:cs="Arial"/>
+          <w:lang w:val="es-ES"/>
+        </w:rPr>
+        <w:t>Página para rechazar o aceptar documentos</w:t>
+      </w:r>
+    </w:p>
+    <w:p>
+      <w:pPr>
+        <w:rPr>
+          <w:rFonts w:ascii="Arial" w:hAnsi="Arial" w:cs="Arial"/>
+          <w:lang w:val="es-ES"/>
+        </w:rPr>
+      </w:pPr>
+      <w:r>
+        <w:rPr>
+          <w:rFonts w:ascii="Arial" w:hAnsi="Arial" w:cs="Arial"/>
+          <w:lang w:val="es-ES"/>
+        </w:rPr>
+        <w:lastRenderedPageBreak/>
+        <w:t xml:space="preserve">En esta página, el administrador o el jefe pueden revisar los documentos que han subido los empleados (o las nuevas versiones de documentos ya existentes) y así poder rechazar o aceptar los documentos. Si se rechaza los documentos, estos no se suben a la base de datos, mientras que, si se aceptan, los documentos pueden ser vistos en la página web por los usuarios. </w:t>
+      </w:r>
+    </w:p>
+    <w:p>
+      <w:pPr>
+        <w:rPr>
+          <w:rFonts w:ascii="Arial" w:hAnsi="Arial" w:cs="Arial"/>
+          <w:lang w:val="es-ES"/>
+        </w:rPr>
+      </w:pPr>
+      <w:r>
+        <w:rPr>
+          <w:rFonts w:ascii="Arial" w:hAnsi="Arial" w:cs="Arial"/>
+          <w:lang w:val="es-ES"/>
+        </w:rPr>
+        <w:t xml:space="preserve">Esta página es esencial porque permite que se pueda verificar toda la información de un documento antes de que este se suba para poder así evitar que se suban documentos erróneos, redundantes o equivocados en las distintas categorías (tal y como subir una versión de un documento en el área equivocada de otro documento). El principal punto de esta página fue la de facilitar la gestión y el control de los distintos documentos para evitar cualquier tipo de errores. </w:t>
+      </w:r>
+    </w:p>
+    <w:p>
+      <w:pPr>
+        <w:rPr>
+          <w:rFonts w:ascii="Arial" w:hAnsi="Arial" w:cs="Arial"/>
+          <w:lang w:val="es-ES"/>
+        </w:rPr>
+      </w:pPr>
+    </w:p>
+    <w:p>
+      <w:pPr>
+        <w:jc w:val="center"/>
+        <w:rPr>
+          <w:rFonts w:ascii="Arial" w:hAnsi="Arial" w:cs="Arial"/>
+          <w:lang w:val="es-ES"/>
+        </w:rPr>
+      </w:pPr>
+      <w:r>
+        <w:rPr>
+          <w:rFonts w:ascii="Arial" w:hAnsi="Arial" w:cs="Arial"/>
+          <w:lang w:val="es-ES"/>
+        </w:rPr>
+        <w:t>Página de comentarios</w:t>
+      </w:r>
+    </w:p>
+    <w:p>
+      <w:pPr>
+        <w:rPr>
+          <w:rFonts w:ascii="Arial" w:hAnsi="Arial" w:cs="Arial"/>
+          <w:lang w:val="es-ES"/>
+        </w:rPr>
+      </w:pPr>
+      <w:r>
+        <w:rPr>
+          <w:rFonts w:ascii="Arial" w:hAnsi="Arial" w:cs="Arial"/>
+          <w:lang w:val="es-ES"/>
+        </w:rPr>
+        <w:t xml:space="preserve">Los documentos específicos, y sus respectivas versiones, tienen la funcionalidad de agregarle documentos para que los otros usuarios los puedan leer. Esta funcionalidad es importante ya que permite que los usuarios puedan comunicar sus dudas o algún comentario que ellos puedan tener sobre los documentos entre ellos mismo (tal y como errores). Esta página funcionará por medio de un pop up, donde se podrá ver todos los comentarios que hay en un documento o en su versionado y donde se podrán dejar comentarios. </w:t>
+      </w:r>
+    </w:p>
+    <w:p>
+      <w:pPr>
+        <w:rPr>
+          <w:rFonts w:ascii="Arial" w:hAnsi="Arial" w:cs="Arial"/>
+          <w:lang w:val="es-ES"/>
+        </w:rPr>
+      </w:pPr>
+      <w:r>
+        <w:rPr>
+          <w:rFonts w:ascii="Arial" w:hAnsi="Arial" w:cs="Arial"/>
+          <w:lang w:val="es-ES"/>
+        </w:rPr>
+        <w:t xml:space="preserve">Creemos que esta parte es esencial, ya que es una forma centralizada en la cual los usuarios pueden comunicarse entre ellos mismos en el sitio web. Así, cuando un usuario </w:t>
+      </w:r>
+      <w:r>
+        <w:rPr>
+          <w:rFonts w:ascii="Arial" w:hAnsi="Arial" w:cs="Arial"/>
+          <w:lang w:val="es-ES"/>
+        </w:rPr>
+        <w:t xml:space="preserve">abre un documento o una versión de un documento, y encuentra un error, este puede comunicárselo a los otros usuarios por medio de estos comentarios, los cuales se graban para cada versión de cada documento. </w:t>
+      </w:r>
+    </w:p>
+    <w:p>
+      <w:pPr>
+        <w:rPr>
+          <w:rFonts w:ascii="Arial" w:hAnsi="Arial" w:cs="Arial"/>
+          <w:lang w:val="es-ES"/>
+        </w:rPr>
+      </w:pPr>
+    </w:p>
+    <w:p>
+      <w:pPr>
+        <w:jc w:val="center"/>
+        <w:rPr>
+          <w:rFonts w:ascii="Arial" w:hAnsi="Arial" w:cs="Arial"/>
+          <w:lang w:val="es-ES"/>
+        </w:rPr>
+      </w:pPr>
+      <w:r>
+        <w:rPr>
+          <w:rFonts w:ascii="Arial" w:hAnsi="Arial" w:cs="Arial"/>
+          <w:lang w:val="es-ES"/>
+        </w:rPr>
+        <w:t>Página de gestión de usuarios</w:t>
+      </w:r>
+    </w:p>
+    <w:p>
+      <w:pPr>
+        <w:rPr>
+          <w:rFonts w:ascii="Arial" w:hAnsi="Arial" w:cs="Arial"/>
+          <w:lang w:val="es-ES"/>
+        </w:rPr>
+      </w:pPr>
+      <w:r>
+        <w:rPr>
+          <w:rFonts w:ascii="Arial" w:hAnsi="Arial" w:cs="Arial"/>
+          <w:lang w:val="es-ES"/>
+        </w:rPr>
+        <w:t xml:space="preserve">El administrador tiene la habilidad de agregar nuevos usuarios y de asignarles sus respectivos roles (los cuales definen que es lo que ellos pueden y no pueden hacer). Es por esto que esta página es importante, ya que es la que permite esa funcionalidad a los administradores. Por medio de esta, se podrá poner la información de los usuarios y asignarles su rol especifico. </w:t>
+      </w:r>
+    </w:p>
+    <w:p>
+      <w:pPr>
+        <w:rPr>
+          <w:rFonts w:ascii="Arial" w:hAnsi="Arial" w:cs="Arial"/>
+          <w:lang w:val="es-ES"/>
+        </w:rPr>
+      </w:pPr>
+      <w:r>
+        <w:rPr>
+          <w:rFonts w:ascii="Arial" w:hAnsi="Arial" w:cs="Arial"/>
+          <w:lang w:val="es-ES"/>
+        </w:rPr>
+        <w:t>Creemos que esta página es importante ya que es la que permite que se agreguen nuevos usuarios al sitio web y a la base de datos, y es la que permite que se les puedan asignar las responsabilidades específicas de cada uno.</w:t>
+      </w:r>
+      <w:r>
+        <w:rPr>
+          <w:rFonts w:ascii="Arial" w:hAnsi="Arial" w:cs="Arial"/>
+          <w:lang w:val="es-ES"/>
+        </w:rPr>
+        <w:t xml:space="preserve"> </w:t>
+      </w:r>
+    </w:p>
+    <w:p>
+      <w:pPr>
+        <w:rPr>
+          <w:rFonts w:ascii="Arial" w:hAnsi="Arial" w:cs="Arial"/>
+          <w:lang w:val="es-ES"/>
+        </w:rPr>
+      </w:pPr>
+    </w:p>
+    <w:p>
+      <w:pPr>
+        <w:pStyle w:val="Ttulo2"/>
+        <w:rPr>
+          <w:rFonts w:ascii="Arial" w:hAnsi="Arial" w:cs="Arial"/>
+          <w:color w:val="auto"/>
+          <w:sz w:val="24"/>
+          <w:szCs w:val="24"/>
+          <w:lang w:val="es-SV"/>
+        </w:rPr>
+      </w:pPr>
+      <w:bookmarkStart w:id="3" w:name="_Toc227002992"/>
+      <w:r>
+        <w:rPr>
+          <w:rFonts w:ascii="Arial" w:hAnsi="Arial" w:cs="Arial"/>
+          <w:color w:val="auto"/>
+          <w:sz w:val="24"/>
+          <w:szCs w:val="24"/>
+          <w:lang w:val="es-SV"/>
+        </w:rPr>
+        <w:t>Capa Lógica</w:t>
+      </w:r>
+      <w:bookmarkEnd w:id="3"/>
+    </w:p>
+    <w:p>
+      <w:pPr>
+        <w:rPr>
+          <w:rFonts w:ascii="Arial" w:hAnsi="Arial" w:cs="Arial"/>
+          <w:lang w:val="es-ES"/>
+        </w:rPr>
+      </w:pPr>
+      <w:r>
+        <w:rPr>
+          <w:rFonts w:ascii="Arial" w:hAnsi="Arial" w:cs="Arial"/>
+          <w:lang w:val="es-ES"/>
+        </w:rPr>
+        <w:t xml:space="preserve">Esta capa es la que se encarga de tratar con toda la lógica del sitio web, es la que permite las distintas funcionalidades a los usuarios. En esta capa, nos estamos enfocando en los distintos servicios que ofrece el sitio web para los usuarios para que ellos puedan hacer uso de estos. </w:t>
+      </w:r>
+    </w:p>
+    <w:p>
+      <w:pPr>
+        <w:rPr>
+          <w:rFonts w:ascii="Arial" w:hAnsi="Arial" w:cs="Arial"/>
+          <w:lang w:val="es-ES"/>
+        </w:rPr>
+      </w:pPr>
+      <w:r>
+        <w:rPr>
+          <w:rFonts w:ascii="Arial" w:hAnsi="Arial" w:cs="Arial"/>
+          <w:lang w:val="es-ES"/>
+        </w:rPr>
+        <w:t xml:space="preserve">Se necesita plantear bien cuáles son los servicios que se ofrecerán a los usuarios, ya que esto es lo que permite que ellos puedan hacer uso de estos en base a las necesidades de ellos. Los servicios deben de ser claros y específicos, ya que por estos es lo que podrán hacer los usuarios de nuestro sitio web. </w:t>
+      </w:r>
+    </w:p>
+    <w:p>
+      <w:pPr>
+        <w:rPr>
+          <w:rFonts w:ascii="Arial" w:hAnsi="Arial" w:cs="Arial"/>
+          <w:lang w:val="es-ES"/>
+        </w:rPr>
+      </w:pPr>
+      <w:r>
+        <w:rPr>
+          <w:rFonts w:ascii="Arial" w:hAnsi="Arial" w:cs="Arial"/>
+          <w:lang w:val="es-ES"/>
+        </w:rPr>
+        <w:t xml:space="preserve">Decidimos ocupar esta capa porque, en base a las distintas vistas que tenemos en la capa de presentación, tenemos que permitir dicha funcionalidad en el sitio web. Es en esta capa donde hacemos esto. Mientras que la capa de presentación muestra al usuario lo que se puede hacer, es esta capa lógica donde realmente ofrecemos y permitimos dicha funcionalidad. </w:t>
+      </w:r>
+    </w:p>
+    <w:p>
+      <w:pPr>
+        <w:rPr>
+          <w:rFonts w:ascii="Arial" w:hAnsi="Arial" w:cs="Arial"/>
+          <w:lang w:val="es-ES"/>
+        </w:rPr>
+      </w:pPr>
+      <w:r>
+        <w:rPr>
+          <w:rFonts w:ascii="Arial" w:hAnsi="Arial" w:cs="Arial"/>
+          <w:lang w:val="es-ES"/>
+        </w:rPr>
+        <w:t>Hemos separado los distintos servicios del sitio web en los siguientes:</w:t>
+      </w:r>
+    </w:p>
+    <w:p>
+      <w:pPr>
+        <w:rPr>
+          <w:rFonts w:ascii="Arial" w:hAnsi="Arial" w:cs="Arial"/>
+          <w:lang w:val="es-ES"/>
+        </w:rPr>
+      </w:pPr>
+    </w:p>
+    <w:p>
+      <w:pPr>
+        <w:jc w:val="center"/>
+        <w:rPr>
+          <w:rFonts w:ascii="Arial" w:hAnsi="Arial" w:cs="Arial"/>
+          <w:lang w:val="es-ES"/>
+        </w:rPr>
+      </w:pPr>
+      <w:r>
+        <w:rPr>
+          <w:rFonts w:ascii="Arial" w:hAnsi="Arial" w:cs="Arial"/>
+          <w:lang w:val="es-ES"/>
+        </w:rPr>
+        <w:t>Validación de usuarios por medio de un login</w:t>
+      </w:r>
+    </w:p>
+    <w:p>
+      <w:pPr>
+        <w:rPr>
+          <w:rFonts w:ascii="Arial" w:hAnsi="Arial" w:cs="Arial"/>
+          <w:lang w:val="es-SV"/>
+        </w:rPr>
+      </w:pPr>
+      <w:r>
+        <w:rPr>
+          <w:rFonts w:ascii="Arial" w:hAnsi="Arial" w:cs="Arial"/>
+          <w:lang w:val="es-SV"/>
+        </w:rPr>
+        <w:t>Lo primero que se necesita es una validación para los usuarios, de esta forma, no solo protegemos los datos de la empresa, sino que también definimos los distintos permisos a los cuales tienen acceso los usuarios. Nuestros usuarios están divididos en 3 distintas categorías: empleado, jefe y administrador (los cuales especificamos anteriormente), por lo que, al ingresar, deben de ir a distintas páginas centrales donde están las distintas opciones de los servicios a los cuales ellos pueden acceder.</w:t>
+      </w:r>
+    </w:p>
+    <w:p>
+      <w:pPr>
+        <w:rPr>
+          <w:rFonts w:ascii="Arial" w:hAnsi="Arial" w:cs="Arial"/>
+          <w:lang w:val="es-SV"/>
+        </w:rPr>
+      </w:pPr>
+      <w:r>
+        <w:rPr>
+          <w:rFonts w:ascii="Arial" w:hAnsi="Arial" w:cs="Arial"/>
+          <w:lang w:val="es-SV"/>
+        </w:rPr>
+        <w:t xml:space="preserve">Esto es importante, porque primero, le da una capa de seguridad al sitio web y a la base de datos, pero aparte de esto, también define qué es lo que puede hacer cada usuario. Si no fuéramos a ocupar esto, primero que todo, cualquiera pudiera acceder al sitio web, pero también habría problemas porque se tuviera que habilitar y deshabilitar botones dependiendo de qué rol tiene el usuario que ingrese. El login nos permite que podemos redireccionar al usuario para ir a una vista central donde solo hay opciones habilitadas a las cuales ellos tienen acceso, lo que simplifica el proceso y mejora la experiencia del usuario. </w:t>
+      </w:r>
+    </w:p>
+    <w:p>
+      <w:pPr>
+        <w:jc w:val="center"/>
+        <w:rPr>
+          <w:rFonts w:ascii="Arial" w:hAnsi="Arial" w:cs="Arial"/>
+          <w:lang w:val="es-SV"/>
+        </w:rPr>
+      </w:pPr>
+      <w:r>
+        <w:rPr>
+          <w:rFonts w:ascii="Arial" w:hAnsi="Arial" w:cs="Arial"/>
+          <w:lang w:val="es-SV"/>
+        </w:rPr>
+        <w:t>Subir un nuevo documento</w:t>
+      </w:r>
+    </w:p>
+    <w:p>
+      <w:pPr>
+        <w:rPr>
+          <w:rFonts w:ascii="Arial" w:hAnsi="Arial" w:cs="Arial"/>
+          <w:lang w:val="es-SV"/>
+        </w:rPr>
+      </w:pPr>
+      <w:r>
+        <w:rPr>
+          <w:rFonts w:ascii="Arial" w:hAnsi="Arial" w:cs="Arial"/>
+          <w:lang w:val="es-SV"/>
+        </w:rPr>
+        <w:t xml:space="preserve">Ya que nuestro sitio web es una plataforma de gestión documental, es necesario de que todos los usuarios tengan la habilidad de subir los documentos que ellos deseen, </w:t>
+      </w:r>
+      <w:r>
+        <w:rPr>
+          <w:rFonts w:ascii="Arial" w:hAnsi="Arial" w:cs="Arial"/>
+          <w:lang w:val="es-SV"/>
+        </w:rPr>
+        <w:lastRenderedPageBreak/>
+        <w:t xml:space="preserve">para poder así acceder a ellos de una forma centralizada, en la cual ellos tendrán acceso a estos. </w:t>
+      </w:r>
+    </w:p>
+    <w:p>
+      <w:pPr>
+        <w:rPr>
+          <w:rFonts w:ascii="Arial" w:hAnsi="Arial" w:cs="Arial"/>
+          <w:lang w:val="es-SV"/>
+        </w:rPr>
+      </w:pPr>
+      <w:r>
+        <w:rPr>
+          <w:rFonts w:ascii="Arial" w:hAnsi="Arial" w:cs="Arial"/>
+          <w:lang w:val="es-SV"/>
+        </w:rPr>
+        <w:t xml:space="preserve">Todos nuestros usuarios tienen la habilidad de subir documentos al sitio web (pero estos tendrán que ser aprobados por un jefe o administrador antes de aparecer en el sitio web), por lo que esto es una de las partes esenciales de nuestro sitio web. Aquí, quisimos simplificar el proceso, por lo que esta la opción de subir un nuevo documento, el cual se creerá en su propia sección (si es aprobado), para facilitar la experiencia del usuario. </w:t>
+      </w:r>
+    </w:p>
+    <w:p>
+      <w:pPr>
+        <w:rPr>
+          <w:rFonts w:ascii="Arial" w:hAnsi="Arial" w:cs="Arial"/>
+          <w:lang w:val="es-SV"/>
+        </w:rPr>
+      </w:pPr>
+      <w:r>
+        <w:rPr>
+          <w:rFonts w:ascii="Arial" w:hAnsi="Arial" w:cs="Arial"/>
+          <w:lang w:val="es-SV"/>
+        </w:rPr>
+        <w:t>Esta funcionalidad es de las más importantes y esenciales del programa, ya que es lo que se nos pidió para mejorar a la empresa.</w:t>
+      </w:r>
+    </w:p>
+    <w:p>
+      <w:pPr>
+        <w:rPr>
+          <w:rFonts w:ascii="Arial" w:hAnsi="Arial" w:cs="Arial"/>
+          <w:lang w:val="es-SV"/>
+        </w:rPr>
+      </w:pPr>
+    </w:p>
+    <w:p>
+      <w:pPr>
+        <w:jc w:val="center"/>
+        <w:rPr>
+          <w:rFonts w:ascii="Arial" w:hAnsi="Arial" w:cs="Arial"/>
+          <w:lang w:val="es-SV"/>
+        </w:rPr>
+      </w:pPr>
+      <w:r>
+        <w:rPr>
+          <w:rFonts w:ascii="Arial" w:hAnsi="Arial" w:cs="Arial"/>
+          <w:lang w:val="es-SV"/>
+        </w:rPr>
+        <w:t>Subir una nueva versión de un documento</w:t>
+      </w:r>
+    </w:p>
+    <w:p>
+      <w:pPr>
+        <w:rPr>
+          <w:rFonts w:ascii="Arial" w:hAnsi="Arial" w:cs="Arial"/>
+          <w:lang w:val="es-ES"/>
+        </w:rPr>
+      </w:pPr>
+      <w:r>
+        <w:rPr>
+          <w:rFonts w:ascii="Arial" w:hAnsi="Arial" w:cs="Arial"/>
+          <w:lang w:val="es-ES"/>
+        </w:rPr>
+        <w:t>Nuestro sitio web es una plataforma de gestión documental con versiones, por lo que, aparte de poder subir nuevos documentos, es necesario que se puedan subir nuevas versiones de estos documentos, específicamente, cuando se haya hecho cambios en estos, con la intención de modernizar el proceso o de mejorar el documento.</w:t>
+      </w:r>
+    </w:p>
+    <w:p>
+      <w:pPr>
+        <w:rPr>
+          <w:rFonts w:ascii="Arial" w:hAnsi="Arial" w:cs="Arial"/>
+          <w:lang w:val="es-ES"/>
+        </w:rPr>
+      </w:pPr>
+      <w:r>
+        <w:rPr>
+          <w:rFonts w:ascii="Arial" w:hAnsi="Arial" w:cs="Arial"/>
+          <w:lang w:val="es-ES"/>
+        </w:rPr>
+        <w:t>Todos nuestros usuarios pueden subir una nueva versión del documento (pero tendrá que ser revisada, aprobada o rechazada primero), por lo que esto también es una parte esencial de nuestro sitio web, ya que es una parte fundamental de lo que se nos pidió. La razón por la cual dividimos el subir documentos y subir una nueva versión del documento, es para facilitar el proceso y la experiencia del usuario, al igual que para evitar errores. Al ser estas dos opciones separadas, se evita posibles problemas donde uno quiso subir una nueva versión del documento, pero lo subió como un nuevo documento o viceversa.</w:t>
+      </w:r>
+    </w:p>
+    <w:p>
+      <w:pPr>
+        <w:rPr>
+          <w:rFonts w:ascii="Arial" w:hAnsi="Arial" w:cs="Arial"/>
+          <w:lang w:val="es-ES"/>
+        </w:rPr>
+      </w:pPr>
+      <w:r>
+        <w:rPr>
+          <w:rFonts w:ascii="Arial" w:hAnsi="Arial" w:cs="Arial"/>
+          <w:lang w:val="es-ES"/>
+        </w:rPr>
+        <w:t xml:space="preserve">Al igual que la funcionalidad de subir un documento, esta funcionalidad es de las más importantes y esenciales del programa, ya que, es de las partes que ocuparan más los usuarios. </w:t>
+      </w:r>
+    </w:p>
+    <w:p>
+      <w:pPr>
+        <w:rPr>
+          <w:rFonts w:ascii="Arial" w:hAnsi="Arial" w:cs="Arial"/>
+          <w:lang w:val="es-ES"/>
+        </w:rPr>
+      </w:pPr>
+    </w:p>
+    <w:p>
+      <w:pPr>
+        <w:jc w:val="center"/>
+        <w:rPr>
+          <w:rFonts w:ascii="Arial" w:hAnsi="Arial" w:cs="Arial"/>
+          <w:lang w:val="es-SV"/>
+        </w:rPr>
+      </w:pPr>
+      <w:r>
+        <w:rPr>
+          <w:rFonts w:ascii="Arial" w:hAnsi="Arial" w:cs="Arial"/>
+          <w:lang w:val="es-SV"/>
+        </w:rPr>
+        <w:t>Poder ver los distintos documentos y sus respectivas versiones</w:t>
+      </w:r>
+    </w:p>
+    <w:p>
+      <w:pPr>
+        <w:rPr>
+          <w:rFonts w:ascii="Arial" w:hAnsi="Arial" w:cs="Arial"/>
+          <w:lang w:val="es-SV"/>
+        </w:rPr>
+      </w:pPr>
+      <w:r>
+        <w:rPr>
+          <w:rFonts w:ascii="Arial" w:hAnsi="Arial" w:cs="Arial"/>
+          <w:lang w:val="es-SV"/>
+        </w:rPr>
+        <w:t>Ya que, lo que pidió la empresa, es una plataforma de gestión documental, es necesario de que todos los usuarios tengan acceso a la base de datos por medio de nuestro sitio web, para poder así acceder a los distintos documentos y sus respectivas versiones. Aparte de eso, se cuenta con una bitácora, la cual permite ver a los usuarios quien subió el documento, quien lo aprobó, la fecha, y en caso, si un documento fue rechazado. Los usuarios podrán bajar los documentos que requieren.</w:t>
+      </w:r>
+    </w:p>
+    <w:p>
+      <w:pPr>
+        <w:rPr>
+          <w:rFonts w:ascii="Arial" w:hAnsi="Arial" w:cs="Arial"/>
+          <w:lang w:val="es-SV"/>
+        </w:rPr>
+      </w:pPr>
+      <w:r>
+        <w:rPr>
+          <w:rFonts w:ascii="Arial" w:hAnsi="Arial" w:cs="Arial"/>
+          <w:lang w:val="es-SV"/>
+        </w:rPr>
+        <w:lastRenderedPageBreak/>
+        <w:t>Los empleados tendrán acceso solo a los documentos específicos de ellos, solo podrán ver los documentos, versiones que ellos han subido y su respectiva la bitácora. En cambio, los administradores y jefes tendrán acceso a todos los documentos y versiones.</w:t>
+      </w:r>
+    </w:p>
+    <w:p>
+      <w:pPr>
+        <w:rPr>
+          <w:rFonts w:ascii="Arial" w:hAnsi="Arial" w:cs="Arial"/>
+          <w:lang w:val="es-SV"/>
+        </w:rPr>
+      </w:pPr>
+      <w:r>
+        <w:rPr>
+          <w:rFonts w:ascii="Arial" w:hAnsi="Arial" w:cs="Arial"/>
+          <w:lang w:val="es-SV"/>
+        </w:rPr>
+        <w:t xml:space="preserve">Esta funcionalidad es esencial, ya que es lo que la empresa nos ha pedido, pero aparte de eso, es esencial porque ayuda a solucionar el problema que se había tenido en la empresa con los métodos de gestión de documentos anteriores (como correos, archivos compartidos o archivos locales, sin un control de versiones). </w:t>
+      </w:r>
+    </w:p>
+    <w:p>
+      <w:pPr>
+        <w:rPr>
+          <w:rFonts w:ascii="Arial" w:hAnsi="Arial" w:cs="Arial"/>
+          <w:lang w:val="es-SV"/>
+        </w:rPr>
+      </w:pPr>
+    </w:p>
+    <w:p>
+      <w:pPr>
+        <w:jc w:val="center"/>
+        <w:rPr>
+          <w:rFonts w:ascii="Arial" w:hAnsi="Arial" w:cs="Arial"/>
+          <w:lang w:val="es-SV"/>
+        </w:rPr>
+      </w:pPr>
+      <w:r>
+        <w:rPr>
+          <w:rFonts w:ascii="Arial" w:hAnsi="Arial" w:cs="Arial"/>
+          <w:lang w:val="es-SV"/>
+        </w:rPr>
+        <w:t>Aprobación o rechazo de documentos</w:t>
+      </w:r>
+    </w:p>
+    <w:p>
+      <w:pPr>
+        <w:rPr>
+          <w:rFonts w:ascii="Arial" w:hAnsi="Arial" w:cs="Arial"/>
+          <w:lang w:val="es-SV"/>
+        </w:rPr>
+      </w:pPr>
+      <w:r>
+        <w:rPr>
+          <w:rFonts w:ascii="Arial" w:hAnsi="Arial" w:cs="Arial"/>
+          <w:lang w:val="es-SV"/>
+        </w:rPr>
+        <w:t xml:space="preserve">Para evitar problemas, en los cuales los empleados están subiendo documentos con casi nada de cambios, o que se han equivocado y subido el mismo documento, se ha decidido implementar un sistema para aprobar o rechazar los documentos por un jefe o administrador, antes de que estos sean ingresados al sitio web y a la base de datos, para que se puedan consultar y bajar. </w:t>
+      </w:r>
+    </w:p>
+    <w:p>
+      <w:pPr>
+        <w:rPr>
+          <w:rFonts w:ascii="Arial" w:hAnsi="Arial" w:cs="Arial"/>
+          <w:lang w:val="es-SV"/>
+        </w:rPr>
+      </w:pPr>
+      <w:r>
+        <w:rPr>
+          <w:rFonts w:ascii="Arial" w:hAnsi="Arial" w:cs="Arial"/>
+          <w:lang w:val="es-SV"/>
+        </w:rPr>
+        <w:t xml:space="preserve">Los jefes o administradores podrán revisar el documento que se ha subido y aprobar o rechazar dicho documento en base a su criterio. Si un documento es aprobado, se guardará en la base de datos, se podrá ver en el sitio web y lo podrán ver los usuarios, aparte de también poder bajar dicho documento. En caso de que un documento sea rechazado, se le mostrara al usuario que lo subió que el documento fue rechazado y este documento no se subirá al sitio web o se guardara en la base de datos. </w:t>
+      </w:r>
+    </w:p>
+    <w:p>
+      <w:pPr>
+        <w:rPr>
+          <w:rFonts w:ascii="Arial" w:hAnsi="Arial" w:cs="Arial"/>
+          <w:lang w:val="es-SV"/>
+        </w:rPr>
+      </w:pPr>
+      <w:r>
+        <w:rPr>
+          <w:rFonts w:ascii="Arial" w:hAnsi="Arial" w:cs="Arial"/>
+          <w:lang w:val="es-SV"/>
+        </w:rPr>
+        <w:t xml:space="preserve">Esta funcionalidad es importante, ya que ayuda a reducir el error que puede venir cuando un usuario intenta subir una misma versión del documento que ya existe, una versión anterior, o que sube una versión con cambios mínimos. Esto permite que pueda haber un buen control de que se sube al sitio web, para que se pueda mantener un estándar alto de calidad. Aparte de eso, esta funcionalidad ayuda a la gestión de los documentos en el sitio web. </w:t>
+      </w:r>
+    </w:p>
+    <w:p>
+      <w:pPr>
+        <w:rPr>
+          <w:rFonts w:ascii="Arial" w:hAnsi="Arial" w:cs="Arial"/>
+          <w:lang w:val="es-SV"/>
+        </w:rPr>
+      </w:pPr>
+    </w:p>
+    <w:p>
+      <w:pPr>
+        <w:jc w:val="center"/>
+        <w:rPr>
+          <w:rFonts w:ascii="Arial" w:hAnsi="Arial" w:cs="Arial"/>
+          <w:lang w:val="es-SV"/>
+        </w:rPr>
+      </w:pPr>
+      <w:r>
+        <w:rPr>
+          <w:rFonts w:ascii="Arial" w:hAnsi="Arial" w:cs="Arial"/>
+          <w:lang w:val="es-SV"/>
+        </w:rPr>
+        <w:t>Ver comentarios en los documentos</w:t>
+      </w:r>
+    </w:p>
+    <w:p>
+      <w:pPr>
+        <w:rPr>
+          <w:rFonts w:ascii="Arial" w:hAnsi="Arial" w:cs="Arial"/>
+          <w:lang w:val="es-SV"/>
+        </w:rPr>
+      </w:pPr>
+      <w:r>
+        <w:rPr>
+          <w:rFonts w:ascii="Arial" w:hAnsi="Arial" w:cs="Arial"/>
+          <w:lang w:val="es-SV"/>
+        </w:rPr>
+        <w:t xml:space="preserve">Para los documentos que ya estén en el sitio web, y sus respectivas versiones, se decidió agregar la habilidad de poner comentarios por parte de los distintos usuarios y que estos puedan ser leídos por otros, para poder así solucionar dudas que puedan </w:t>
+      </w:r>
+      <w:r>
+        <w:rPr>
+          <w:rFonts w:ascii="Arial" w:hAnsi="Arial" w:cs="Arial"/>
+          <w:lang w:val="es-SV"/>
+        </w:rPr>
+        <w:t xml:space="preserve">resultar por estos, o para aclarar ciertos temas. </w:t>
+      </w:r>
+    </w:p>
+    <w:p>
+      <w:pPr>
+        <w:rPr>
+          <w:rFonts w:ascii="Arial" w:hAnsi="Arial" w:cs="Arial"/>
+          <w:lang w:val="es-SV"/>
+        </w:rPr>
+      </w:pPr>
+      <w:r>
+        <w:rPr>
+          <w:rFonts w:ascii="Arial" w:hAnsi="Arial" w:cs="Arial"/>
+          <w:lang w:val="es-SV"/>
+        </w:rPr>
+        <w:t xml:space="preserve">Aunque esta funcionalidad no nos la pidió la empresa, sentimos que es importante ya que permite que las dudas o aclaraciones que se hagan de los respectivos </w:t>
+      </w:r>
+      <w:r>
+        <w:rPr>
+          <w:rFonts w:ascii="Arial" w:hAnsi="Arial" w:cs="Arial"/>
+          <w:lang w:val="es-SV"/>
+        </w:rPr>
+        <w:lastRenderedPageBreak/>
+        <w:t xml:space="preserve">documentos, se guarden y se mantenga en el mismo lugar donde está el documento, para que así todos los que accedan a este puedan siempre tener acceso a estos. </w:t>
+      </w:r>
+    </w:p>
+    <w:p>
+      <w:pPr>
+        <w:rPr>
+          <w:rFonts w:ascii="Arial" w:hAnsi="Arial" w:cs="Arial"/>
+          <w:lang w:val="es-SV"/>
+        </w:rPr>
+      </w:pPr>
+    </w:p>
+    <w:p>
+      <w:pPr>
+        <w:jc w:val="center"/>
+        <w:rPr>
+          <w:rFonts w:ascii="Arial" w:hAnsi="Arial" w:cs="Arial"/>
+          <w:lang w:val="es-SV"/>
+        </w:rPr>
+      </w:pPr>
+      <w:r>
+        <w:rPr>
+          <w:rFonts w:ascii="Arial" w:hAnsi="Arial" w:cs="Arial"/>
+          <w:lang w:val="es-SV"/>
+        </w:rPr>
+        <w:t>Control de roles</w:t>
+      </w:r>
+    </w:p>
+    <w:p>
+      <w:pPr>
+        <w:rPr>
+          <w:rFonts w:ascii="Arial" w:hAnsi="Arial" w:cs="Arial"/>
+          <w:lang w:val="es-SV"/>
+        </w:rPr>
+      </w:pPr>
+      <w:r>
+        <w:rPr>
+          <w:rFonts w:ascii="Arial" w:hAnsi="Arial" w:cs="Arial"/>
+          <w:lang w:val="es-SV"/>
+        </w:rPr>
+        <w:t xml:space="preserve">Ya que nuestra plataforma de gestión documental cuenta con usuarios que se dividen en 3 distintos roles (los cuales mencionas anteriormente): empleado, jefe y administrador, es necesario de que hubiera una manera específica de crear nuevos usuarios y de asignarles sus roles específicos. De esto se encargará el administrador, el cual es el único usuario que tiene esta funcionalidad. El administrador podrá agregar nuevos empleados y asignarles su rol. </w:t>
+      </w:r>
+    </w:p>
+    <w:p>
+      <w:pPr>
+        <w:rPr>
+          <w:rFonts w:ascii="Arial" w:hAnsi="Arial" w:cs="Arial"/>
+          <w:lang w:val="es-SV"/>
+        </w:rPr>
+      </w:pPr>
+      <w:r>
+        <w:rPr>
+          <w:rFonts w:ascii="Arial" w:hAnsi="Arial" w:cs="Arial"/>
+          <w:lang w:val="es-SV"/>
+        </w:rPr>
+        <w:t>Esta funcionalidad es importante ya que permite que se puedan agregar nuevos empleados de la empresa, para que estos puedan acceder al sitio web, y para que solo puedan cumplir un rol especifico.</w:t>
+      </w:r>
+    </w:p>
+    <w:p>
+      <w:pPr>
+        <w:rPr>
+          <w:rFonts w:ascii="Arial" w:hAnsi="Arial" w:cs="Arial"/>
+          <w:lang w:val="es-SV"/>
+        </w:rPr>
+      </w:pPr>
+    </w:p>
+    <w:p>
+      <w:pPr>
+        <w:pStyle w:val="Ttulo2"/>
+        <w:rPr>
+          <w:rFonts w:ascii="Arial" w:hAnsi="Arial" w:cs="Arial"/>
+          <w:color w:val="auto"/>
+          <w:sz w:val="24"/>
+          <w:szCs w:val="24"/>
+          <w:lang w:val="es-SV"/>
+        </w:rPr>
+      </w:pPr>
+      <w:bookmarkStart w:id="4" w:name="_Toc227002993"/>
+      <w:r>
+        <w:rPr>
+          <w:rFonts w:ascii="Arial" w:hAnsi="Arial" w:cs="Arial"/>
+          <w:color w:val="auto"/>
+          <w:sz w:val="24"/>
+          <w:szCs w:val="24"/>
+          <w:lang w:val="es-SV"/>
+        </w:rPr>
+        <w:t>Capa de Datos</w:t>
+      </w:r>
+      <w:bookmarkEnd w:id="4"/>
+    </w:p>
+    <w:p>
+      <w:pPr>
+        <w:rPr>
+          <w:rFonts w:ascii="Arial" w:hAnsi="Arial" w:cs="Arial"/>
+          <w:lang w:val="es-SV"/>
+        </w:rPr>
+      </w:pPr>
+      <w:r>
+        <w:rPr>
+          <w:rFonts w:ascii="Arial" w:hAnsi="Arial" w:cs="Arial"/>
+          <w:lang w:val="es-SV"/>
+        </w:rPr>
+        <w:t xml:space="preserve">Esta capa es donde se controlará todas las bases de datos y el acceso a estas por medio del sitio web. El sitio web tendrá que tener un acceso a las distintas bases de datos, en donde guardaremos los documentos, la información de los usuarios e una bitácora de información  </w:t>
+      </w:r>
+    </w:p>
+    <w:p>
+      <w:pPr>
+        <w:rPr>
+          <w:rFonts w:ascii="Arial" w:hAnsi="Arial" w:cs="Arial"/>
+          <w:lang w:val="es-SV"/>
+        </w:rPr>
+      </w:pPr>
+      <w:r>
+        <w:rPr>
+          <w:rFonts w:ascii="Arial" w:hAnsi="Arial" w:cs="Arial"/>
+          <w:lang w:val="es-SV"/>
+        </w:rPr>
+        <w:t xml:space="preserve">Decidimos ocupar esta capa especifica ya que el sitio web es una plataforma de gestión documental con versiones, que incluye información de los documentos, de los empleados y sus respectivos roles, y otra información que sea relevante. Toda esta información es guardada en bases de datos MySQL y el acceso a ellos viene por el sitio web y los respectivos permisos que tienen los usuarios.   </w:t>
+      </w:r>
+    </w:p>
+    <w:p>
+      <w:pPr>
+        <w:rPr>
+          <w:rFonts w:ascii="Arial" w:hAnsi="Arial" w:cs="Arial"/>
+          <w:lang w:val="es-SV"/>
+        </w:rPr>
+      </w:pPr>
+      <w:r>
+        <w:rPr>
+          <w:rFonts w:ascii="Arial" w:hAnsi="Arial" w:cs="Arial"/>
+          <w:lang w:val="es-SV"/>
+        </w:rPr>
+        <w:t>Se prestó gran atención a la creación de las bases de datos, ya que de estas dependerá que todo el sistema pueda funcionar e integrarse bien. Decidimos ocupar las siguientes tablas:</w:t>
+      </w:r>
+    </w:p>
+    <w:p>
+      <w:pPr>
+        <w:rPr>
+          <w:rFonts w:ascii="Arial" w:hAnsi="Arial" w:cs="Arial"/>
+          <w:lang w:val="es-SV"/>
+        </w:rPr>
+      </w:pPr>
+    </w:p>
+    <w:p>
+      <w:pPr>
+        <w:rPr>
+          <w:rFonts w:ascii="Arial" w:hAnsi="Arial" w:cs="Arial"/>
+          <w:lang w:val="es-SV"/>
+        </w:rPr>
+      </w:pPr>
+    </w:p>
+    <w:p>
+      <w:pPr>
+        <w:rPr>
+          <w:rFonts w:ascii="Arial" w:hAnsi="Arial" w:cs="Arial"/>
+          <w:lang w:val="es-SV"/>
+        </w:rPr>
+      </w:pPr>
+    </w:p>
+    <w:p>
+      <w:pPr>
+        <w:jc w:val="center"/>
+        <w:rPr>
+          <w:rFonts w:ascii="Arial" w:hAnsi="Arial" w:cs="Arial"/>
+          <w:lang w:val="es-SV"/>
+        </w:rPr>
+      </w:pPr>
+      <w:r>
+        <w:rPr>
+          <w:rFonts w:ascii="Arial" w:hAnsi="Arial" w:cs="Arial"/>
+          <w:lang w:val="es-SV"/>
+        </w:rPr>
+        <w:t>Roles</w:t>
+      </w:r>
+    </w:p>
+    <w:p>
+      <w:pPr>
+        <w:rPr>
+          <w:rFonts w:ascii="Arial" w:hAnsi="Arial" w:cs="Arial"/>
+          <w:lang w:val="es-SV"/>
+        </w:rPr>
+      </w:pPr>
+      <w:r>
+        <w:rPr>
+          <w:rFonts w:ascii="Arial" w:hAnsi="Arial" w:cs="Arial"/>
+          <w:lang w:val="es-SV"/>
+        </w:rPr>
+        <w:t xml:space="preserve">Estaremos ocupando distintos usuarios en nuestro sitio web (usuario, administrador y jefe), teniendo cada uno de ellos, distintos permisos en este. Debido a esto, decidimos </w:t>
+      </w:r>
+      <w:r>
+        <w:rPr>
+          <w:rFonts w:ascii="Arial" w:hAnsi="Arial" w:cs="Arial"/>
+          <w:lang w:val="es-SV"/>
+        </w:rPr>
+        <w:lastRenderedPageBreak/>
+        <w:t xml:space="preserve">crear una tabla de roles, para evitar así tener que crear 3 distintas tablas de usuarios. Esto simplifica la base de datos y el sitio web. </w:t>
+      </w:r>
+    </w:p>
+    <w:p>
+      <w:pPr>
+        <w:rPr>
+          <w:rFonts w:ascii="Arial" w:hAnsi="Arial" w:cs="Arial"/>
+          <w:lang w:val="es-SV"/>
+        </w:rPr>
+      </w:pPr>
+      <w:r>
+        <w:rPr>
+          <w:rFonts w:ascii="Arial" w:hAnsi="Arial" w:cs="Arial"/>
+          <w:lang w:val="es-SV"/>
+        </w:rPr>
+        <w:t xml:space="preserve">Por medio de esta tabla, establecemos el id del rol especifico y luego esta se conecta a los usuarios, para que se pueda especificar cual rol es el que ellos tienen. </w:t>
+      </w:r>
+    </w:p>
+    <w:p>
+      <w:pPr>
+        <w:rPr>
+          <w:rFonts w:ascii="Arial" w:hAnsi="Arial" w:cs="Arial"/>
+          <w:lang w:val="es-SV"/>
+        </w:rPr>
+      </w:pPr>
+      <w:r>
+        <w:rPr>
+          <w:rFonts w:ascii="Arial" w:hAnsi="Arial" w:cs="Arial"/>
+          <w:lang w:val="es-SV"/>
+        </w:rPr>
+        <w:t xml:space="preserve">La tabla es la siguiente y contiene: </w:t>
+      </w:r>
+    </w:p>
+    <w:p>
+      <w:pPr>
+        <w:rPr>
+          <w:rFonts w:ascii="Arial" w:hAnsi="Arial" w:cs="Arial"/>
+          <w:lang w:val="es-SV"/>
+        </w:rPr>
+      </w:pPr>
+      <w:r>
+        <w:rPr>
+          <w:rFonts w:ascii="Arial" w:hAnsi="Arial" w:cs="Arial"/>
+          <w:lang w:val="es-SV"/>
+        </w:rPr>
+        <w:t xml:space="preserve">id_rol: El cuál es el identificador de cada rol especifico. </w:t>
+      </w:r>
+    </w:p>
+    <w:p>
+      <w:pPr>
+        <w:rPr>
+          <w:rFonts w:ascii="Arial" w:hAnsi="Arial" w:cs="Arial"/>
+          <w:lang w:val="es-SV"/>
+        </w:rPr>
+      </w:pPr>
+      <w:r>
+        <w:rPr>
+          <w:rFonts w:ascii="Arial" w:hAnsi="Arial" w:cs="Arial"/>
+          <w:lang w:val="es-SV"/>
+        </w:rPr>
+        <w:t xml:space="preserve">nombre: El cuál es el nombre del rol especifico. </w:t>
+      </w:r>
+    </w:p>
+    <w:p>
+      <w:pPr>
+        <w:jc w:val="center"/>
+        <w:rPr>
+          <w:rFonts w:ascii="Arial" w:hAnsi="Arial" w:cs="Arial"/>
+          <w:lang w:val="es-SV"/>
+        </w:rPr>
+      </w:pPr>
+      <w:r>
+        <w:rPr>
+          <w:rFonts w:ascii="Arial" w:hAnsi="Arial" w:cs="Arial"/>
+          <w:noProof/>
+          <w:lang w:val="es-SV" w:eastAsia="es-SV"/>
+        </w:rPr>
+        <w:drawing>
+          <wp:inline distT="0" distB="0" distL="0" distR="0" wp14:anchorId="722442E7" wp14:editId="742796D8">
+            <wp:extent cx="5943600" cy="387350"/>
+            <wp:effectExtent l="0" t="0" r="0" b="0"/>
+            <wp:docPr id="1" name="Imagen 1"/>
+            <wp:cNvGraphicFramePr>
+              <a:graphicFrameLocks xmlns:a="http://schemas.openxmlformats.org/drawingml/2006/main" noChangeAspect="1"/>
+            </wp:cNvGraphicFramePr>
+            <a:graphic xmlns:a="http://schemas.openxmlformats.org/drawingml/2006/main">
+              <a:graphicData uri="http://schemas.openxmlformats.org/drawingml/2006/picture">
+                <pic:pic xmlns:pic="http://schemas.openxmlformats.org/drawingml/2006/picture">
+                  <pic:nvPicPr>
+                    <pic:cNvPr id="1" name=""/>
+                    <pic:cNvPicPr/>
+                  </pic:nvPicPr>
+                  <pic:blipFill>
+                    <a:blip r:embed="rId10"/>
+                    <a:stretch>
+                      <a:fillRect/>
+                    </a:stretch>
+                  </pic:blipFill>
+                  <pic:spPr>
+                    <a:xfrm>
+                      <a:off x="0" y="0"/>
+                      <a:ext cx="5943600" cy="387350"/>
+                    </a:xfrm>
+                    <a:prstGeom prst="rect">
+                      <a:avLst/>
+                    </a:prstGeom>
+                  </pic:spPr>
+                </pic:pic>
+              </a:graphicData>
+            </a:graphic>
+          </wp:inline>
+        </w:drawing>
+      </w:r>
+    </w:p>
+    <w:p>
+      <w:pPr>
+        <w:rPr>
+          <w:rFonts w:ascii="Arial" w:hAnsi="Arial" w:cs="Arial"/>
+          <w:lang w:val="es-SV"/>
+        </w:rPr>
+      </w:pPr>
+    </w:p>
+    <w:p>
+      <w:pPr>
+        <w:jc w:val="center"/>
+        <w:rPr>
+          <w:rFonts w:ascii="Arial" w:hAnsi="Arial" w:cs="Arial"/>
+          <w:lang w:val="es-SV"/>
+        </w:rPr>
+      </w:pPr>
+      <w:r>
+        <w:rPr>
+          <w:rFonts w:ascii="Arial" w:hAnsi="Arial" w:cs="Arial"/>
+          <w:lang w:val="es-SV"/>
+        </w:rPr>
+        <w:t>Usuarios</w:t>
+      </w:r>
+    </w:p>
+    <w:p>
+      <w:pPr>
+        <w:rPr>
+          <w:rFonts w:ascii="Arial" w:hAnsi="Arial" w:cs="Arial"/>
+          <w:lang w:val="es-SV"/>
+        </w:rPr>
+      </w:pPr>
+      <w:r>
+        <w:rPr>
+          <w:rFonts w:ascii="Arial" w:hAnsi="Arial" w:cs="Arial"/>
+          <w:lang w:val="es-SV"/>
+        </w:rPr>
+        <w:t xml:space="preserve">Esta tabla contiene toda la información básica de los usuarios (tal como sus nombres, correos y passwords), pero lo más importante es la conexión que esta tiene con la tabla de roles, ya que es por esta forma en la cual podemos definir cuál es el rol del usuario, ya sea administrador, jefe o empleado. </w:t>
+      </w:r>
+    </w:p>
+    <w:p>
+      <w:pPr>
+        <w:rPr>
+          <w:rFonts w:ascii="Arial" w:hAnsi="Arial" w:cs="Arial"/>
+          <w:lang w:val="es-SV"/>
+        </w:rPr>
+      </w:pPr>
+      <w:r>
+        <w:rPr>
+          <w:rFonts w:ascii="Arial" w:hAnsi="Arial" w:cs="Arial"/>
+          <w:lang w:val="es-SV"/>
+        </w:rPr>
+        <w:t xml:space="preserve">La tabla es la siguiente y contiene: </w:t>
+      </w:r>
+    </w:p>
+    <w:p>
+      <w:pPr>
+        <w:rPr>
+          <w:rFonts w:ascii="Arial" w:hAnsi="Arial" w:cs="Arial"/>
+          <w:lang w:val="es-SV"/>
+        </w:rPr>
+      </w:pPr>
+      <w:r>
+        <w:rPr>
+          <w:rFonts w:ascii="Arial" w:hAnsi="Arial" w:cs="Arial"/>
+          <w:lang w:val="es-SV"/>
+        </w:rPr>
+        <w:t xml:space="preserve">id_usuario: el cuál es el identificador de usuario. </w:t>
+      </w:r>
+    </w:p>
+    <w:p>
+      <w:pPr>
+        <w:rPr>
+          <w:rFonts w:ascii="Arial" w:hAnsi="Arial" w:cs="Arial"/>
+          <w:lang w:val="es-SV"/>
+        </w:rPr>
+      </w:pPr>
+      <w:r>
+        <w:rPr>
+          <w:rFonts w:ascii="Arial" w:hAnsi="Arial" w:cs="Arial"/>
+          <w:lang w:val="es-SV"/>
+        </w:rPr>
+        <w:t xml:space="preserve">nombre: el nombre del usuario. </w:t>
+      </w:r>
+    </w:p>
+    <w:p>
+      <w:pPr>
+        <w:rPr>
+          <w:rFonts w:ascii="Arial" w:hAnsi="Arial" w:cs="Arial"/>
+          <w:lang w:val="es-SV"/>
+        </w:rPr>
+      </w:pPr>
+      <w:r>
+        <w:rPr>
+          <w:rFonts w:ascii="Arial" w:hAnsi="Arial" w:cs="Arial"/>
+          <w:lang w:val="es-SV"/>
+        </w:rPr>
+        <w:t xml:space="preserve">Correo: el correo que ocupa el usuario para ingresar al sitio web. </w:t>
+      </w:r>
+    </w:p>
+    <w:p>
+      <w:pPr>
+        <w:rPr>
+          <w:rFonts w:ascii="Arial" w:hAnsi="Arial" w:cs="Arial"/>
+          <w:lang w:val="es-SV"/>
+        </w:rPr>
+      </w:pPr>
+      <w:r>
+        <w:rPr>
+          <w:rFonts w:ascii="Arial" w:hAnsi="Arial" w:cs="Arial"/>
+          <w:lang w:val="es-SV"/>
+        </w:rPr>
+        <w:t xml:space="preserve">password: el password que ocupa el usuario para ingresar al sitio web. </w:t>
+      </w:r>
+    </w:p>
+    <w:p>
+      <w:pPr>
+        <w:rPr>
+          <w:rFonts w:ascii="Arial" w:hAnsi="Arial" w:cs="Arial"/>
+          <w:lang w:val="es-SV"/>
+        </w:rPr>
+      </w:pPr>
+      <w:r>
+        <w:rPr>
+          <w:rFonts w:ascii="Arial" w:hAnsi="Arial" w:cs="Arial"/>
+          <w:lang w:val="es-SV"/>
+        </w:rPr>
+        <w:t xml:space="preserve">id_rol: el cuál es el identificador de cada rol especifico y se ocupa para especificar a qué rol pertenece el usuario y que permisos tiene este. </w:t>
+      </w:r>
+    </w:p>
+    <w:p>
+      <w:pPr>
+        <w:rPr>
+          <w:rFonts w:ascii="Arial" w:hAnsi="Arial" w:cs="Arial"/>
+          <w:lang w:val="es-SV"/>
+        </w:rPr>
+      </w:pPr>
+      <w:r>
+        <w:rPr>
+          <w:rFonts w:ascii="Arial" w:hAnsi="Arial" w:cs="Arial"/>
+          <w:lang w:val="es-SV"/>
+        </w:rPr>
+        <w:t xml:space="preserve">Fecha_creacion: la fecha de creación de la cuenta del empleado. </w:t>
+      </w:r>
+    </w:p>
+    <w:p>
+      <w:pPr>
+        <w:rPr>
+          <w:rFonts w:ascii="Arial" w:hAnsi="Arial" w:cs="Arial"/>
+          <w:lang w:val="es-SV"/>
+        </w:rPr>
+      </w:pPr>
+      <w:r>
+        <w:rPr>
+          <w:rFonts w:ascii="Arial" w:hAnsi="Arial" w:cs="Arial"/>
+          <w:noProof/>
+          <w:lang w:val="es-SV" w:eastAsia="es-SV"/>
+        </w:rPr>
+        <w:drawing>
+          <wp:inline distT="0" distB="0" distL="0" distR="0" wp14:anchorId="2DD2D149" wp14:editId="0BB397E4">
+            <wp:extent cx="5943600" cy="800100"/>
+            <wp:effectExtent l="0" t="0" r="0" b="0"/>
+            <wp:docPr id="2" name="Imagen 2"/>
+            <wp:cNvGraphicFramePr>
+              <a:graphicFrameLocks xmlns:a="http://schemas.openxmlformats.org/drawingml/2006/main" noChangeAspect="1"/>
+            </wp:cNvGraphicFramePr>
+            <a:graphic xmlns:a="http://schemas.openxmlformats.org/drawingml/2006/main">
+              <a:graphicData uri="http://schemas.openxmlformats.org/drawingml/2006/picture">
+                <pic:pic xmlns:pic="http://schemas.openxmlformats.org/drawingml/2006/picture">
+                  <pic:nvPicPr>
+                    <pic:cNvPr id="1" name=""/>
+                    <pic:cNvPicPr/>
+                  </pic:nvPicPr>
+                  <pic:blipFill>
+                    <a:blip r:embed="rId11"/>
+                    <a:stretch>
+                      <a:fillRect/>
+                    </a:stretch>
+                  </pic:blipFill>
+                  <pic:spPr>
+                    <a:xfrm>
+                      <a:off x="0" y="0"/>
+                      <a:ext cx="5943600" cy="800100"/>
+                    </a:xfrm>
+                    <a:prstGeom prst="rect">
+                      <a:avLst/>
+                    </a:prstGeom>
+                  </pic:spPr>
+                </pic:pic>
+              </a:graphicData>
+            </a:graphic>
+          </wp:inline>
+        </w:drawing>
+      </w:r>
+    </w:p>
+    <w:p>
+      <w:pPr>
+        <w:rPr>
+          <w:rFonts w:ascii="Arial" w:hAnsi="Arial" w:cs="Arial"/>
+          <w:lang w:val="es-SV"/>
+        </w:rPr>
+      </w:pPr>
+    </w:p>
+    <w:p>
+      <w:pPr>
+        <w:jc w:val="center"/>
+        <w:rPr>
+          <w:rFonts w:ascii="Arial" w:hAnsi="Arial" w:cs="Arial"/>
+          <w:lang w:val="es-SV"/>
+        </w:rPr>
+      </w:pPr>
+      <w:r>
+        <w:rPr>
+          <w:rFonts w:ascii="Arial" w:hAnsi="Arial" w:cs="Arial"/>
+          <w:lang w:val="es-SV"/>
+        </w:rPr>
+        <w:t>Documentos</w:t>
+      </w:r>
+    </w:p>
+    <w:p>
+      <w:pPr>
+        <w:jc w:val="both"/>
+        <w:rPr>
+          <w:rFonts w:ascii="Arial" w:hAnsi="Arial" w:cs="Arial"/>
+          <w:lang w:val="es-SV"/>
+        </w:rPr>
+      </w:pPr>
+      <w:r>
+        <w:rPr>
+          <w:rFonts w:ascii="Arial" w:hAnsi="Arial" w:cs="Arial"/>
+          <w:lang w:val="es-SV"/>
+        </w:rPr>
+        <w:t xml:space="preserve">Esta tabla contiene toda la información pertinente a los documentos que se suben al sitio web. Es por medio de esta tabla que podemos hacer la creación de un espacio específico </w:t>
+      </w:r>
+      <w:r>
+        <w:rPr>
+          <w:rFonts w:ascii="Arial" w:hAnsi="Arial" w:cs="Arial"/>
+          <w:lang w:val="es-SV"/>
+        </w:rPr>
+        <w:lastRenderedPageBreak/>
+        <w:t xml:space="preserve">para cada documento (el cual luego se puede expandir para agregar nuevas versiones). Esta tabla tiene conexión con la tabla de versiones_documentos, ya que por medio de estas se controla el versionado. </w:t>
+      </w:r>
+    </w:p>
+    <w:p>
+      <w:pPr>
+        <w:rPr>
+          <w:rFonts w:ascii="Arial" w:hAnsi="Arial" w:cs="Arial"/>
+          <w:lang w:val="es-SV"/>
+        </w:rPr>
+      </w:pPr>
+      <w:r>
+        <w:rPr>
+          <w:rFonts w:ascii="Arial" w:hAnsi="Arial" w:cs="Arial"/>
+          <w:lang w:val="es-SV"/>
+        </w:rPr>
+        <w:t xml:space="preserve">La tabla es la siguiente y contiene: </w:t>
+      </w:r>
+    </w:p>
+    <w:p>
+      <w:pPr>
+        <w:jc w:val="both"/>
+        <w:rPr>
+          <w:rFonts w:ascii="Arial" w:hAnsi="Arial" w:cs="Arial"/>
+          <w:lang w:val="es-SV"/>
+        </w:rPr>
+      </w:pPr>
+      <w:r>
+        <w:rPr>
+          <w:rFonts w:ascii="Arial" w:hAnsi="Arial" w:cs="Arial"/>
+          <w:lang w:val="es-SV"/>
+        </w:rPr>
+        <w:t xml:space="preserve">id_documento: el identificador del documento. </w:t>
+      </w:r>
+    </w:p>
+    <w:p>
+      <w:pPr>
+        <w:jc w:val="both"/>
+        <w:rPr>
+          <w:rFonts w:ascii="Arial" w:hAnsi="Arial" w:cs="Arial"/>
+          <w:lang w:val="es-SV"/>
+        </w:rPr>
+      </w:pPr>
+      <w:r>
+        <w:rPr>
+          <w:rFonts w:ascii="Arial" w:hAnsi="Arial" w:cs="Arial"/>
+          <w:lang w:val="es-SV"/>
+        </w:rPr>
+        <w:t>título: el título del documento.</w:t>
+      </w:r>
+    </w:p>
+    <w:p>
+      <w:pPr>
+        <w:jc w:val="both"/>
+        <w:rPr>
+          <w:rFonts w:ascii="Arial" w:hAnsi="Arial" w:cs="Arial"/>
+          <w:lang w:val="es-SV"/>
+        </w:rPr>
+      </w:pPr>
+      <w:r>
+        <w:rPr>
+          <w:rFonts w:ascii="Arial" w:hAnsi="Arial" w:cs="Arial"/>
+          <w:lang w:val="es-SV"/>
+        </w:rPr>
+        <w:t xml:space="preserve">descripción: la descripción del documento. </w:t>
+      </w:r>
+    </w:p>
+    <w:p>
+      <w:pPr>
+        <w:jc w:val="both"/>
+        <w:rPr>
+          <w:rFonts w:ascii="Arial" w:hAnsi="Arial" w:cs="Arial"/>
+          <w:lang w:val="es-SV"/>
+        </w:rPr>
+      </w:pPr>
+      <w:r>
+        <w:rPr>
+          <w:rFonts w:ascii="Arial" w:hAnsi="Arial" w:cs="Arial"/>
+          <w:lang w:val="es-SV"/>
+        </w:rPr>
+        <w:t xml:space="preserve">creado_por: relación con la tabla de usuarios, con la cual podemos identificar quien es el que subió el documento. </w:t>
+      </w:r>
+    </w:p>
+    <w:p>
+      <w:pPr>
+        <w:jc w:val="both"/>
+        <w:rPr>
+          <w:rFonts w:ascii="Arial" w:hAnsi="Arial" w:cs="Arial"/>
+          <w:lang w:val="es-SV"/>
+        </w:rPr>
+      </w:pPr>
+      <w:r>
+        <w:rPr>
+          <w:rFonts w:ascii="Arial" w:hAnsi="Arial" w:cs="Arial"/>
+          <w:lang w:val="es-SV"/>
+        </w:rPr>
+        <w:t xml:space="preserve">fecha_creacion: es la fecha que se subió el documento. </w:t>
+      </w:r>
+    </w:p>
+    <w:p>
+      <w:pPr>
+        <w:jc w:val="both"/>
+        <w:rPr>
+          <w:rFonts w:ascii="Arial" w:hAnsi="Arial" w:cs="Arial"/>
+          <w:lang w:val="es-SV"/>
+        </w:rPr>
+      </w:pPr>
+      <w:r>
+        <w:rPr>
+          <w:rFonts w:ascii="Arial" w:hAnsi="Arial" w:cs="Arial"/>
+          <w:lang w:val="es-SV"/>
+        </w:rPr>
+        <w:t xml:space="preserve">ruta_archivo: es donde se guardará el archivo para poder acceder a él para bajarlo o revisarlo. </w:t>
+      </w:r>
+    </w:p>
+    <w:p>
+      <w:pPr>
+        <w:jc w:val="both"/>
+        <w:rPr>
+          <w:rFonts w:ascii="Arial" w:hAnsi="Arial" w:cs="Arial"/>
+          <w:lang w:val="es-SV"/>
+        </w:rPr>
+      </w:pPr>
+      <w:r>
+        <w:rPr>
+          <w:rFonts w:ascii="Arial" w:hAnsi="Arial" w:cs="Arial"/>
+          <w:noProof/>
+          <w:lang w:val="es-SV" w:eastAsia="es-SV"/>
+        </w:rPr>
+        <w:drawing>
+          <wp:inline distT="0" distB="0" distL="0" distR="0" wp14:anchorId="03D6CC6A" wp14:editId="626CB607">
+            <wp:extent cx="5738357" cy="739204"/>
+            <wp:effectExtent l="0" t="0" r="0" b="3810"/>
+            <wp:docPr id="3" name="Imagen 3"/>
+            <wp:cNvGraphicFramePr>
+              <a:graphicFrameLocks xmlns:a="http://schemas.openxmlformats.org/drawingml/2006/main" noChangeAspect="1"/>
+            </wp:cNvGraphicFramePr>
+            <a:graphic xmlns:a="http://schemas.openxmlformats.org/drawingml/2006/main">
+              <a:graphicData uri="http://schemas.openxmlformats.org/drawingml/2006/picture">
+                <pic:pic xmlns:pic="http://schemas.openxmlformats.org/drawingml/2006/picture">
+                  <pic:nvPicPr>
+                    <pic:cNvPr id="1" name=""/>
+                    <pic:cNvPicPr/>
+                  </pic:nvPicPr>
+                  <pic:blipFill>
+                    <a:blip r:embed="rId12"/>
+                    <a:stretch>
+                      <a:fillRect/>
+                    </a:stretch>
+                  </pic:blipFill>
+                  <pic:spPr>
+                    <a:xfrm>
+                      <a:off x="0" y="0"/>
+                      <a:ext cx="5738357" cy="739204"/>
+                    </a:xfrm>
+                    <a:prstGeom prst="rect">
+                      <a:avLst/>
+                    </a:prstGeom>
+                  </pic:spPr>
+                </pic:pic>
+              </a:graphicData>
+            </a:graphic>
+          </wp:inline>
+        </w:drawing>
+      </w:r>
+    </w:p>
+    <w:p>
+      <w:pPr>
+        <w:rPr>
+          <w:rFonts w:ascii="Arial" w:hAnsi="Arial" w:cs="Arial"/>
+          <w:lang w:val="es-SV"/>
+        </w:rPr>
+      </w:pPr>
+    </w:p>
+    <w:p>
+      <w:pPr>
+        <w:jc w:val="center"/>
+        <w:rPr>
+          <w:rFonts w:ascii="Arial" w:hAnsi="Arial" w:cs="Arial"/>
+          <w:lang w:val="es-SV"/>
+        </w:rPr>
+      </w:pPr>
+      <w:r>
+        <w:rPr>
+          <w:rFonts w:ascii="Arial" w:hAnsi="Arial" w:cs="Arial"/>
+          <w:lang w:val="es-SV"/>
+        </w:rPr>
+        <w:t>Versiones_documento</w:t>
+      </w:r>
+    </w:p>
+    <w:p>
+      <w:pPr>
+        <w:rPr>
+          <w:rFonts w:ascii="Arial" w:hAnsi="Arial" w:cs="Arial"/>
+          <w:lang w:val="es-SV"/>
+        </w:rPr>
+      </w:pPr>
+      <w:r>
+        <w:rPr>
+          <w:rFonts w:ascii="Arial" w:hAnsi="Arial" w:cs="Arial"/>
+          <w:lang w:val="es-SV"/>
+        </w:rPr>
+        <w:t xml:space="preserve">Esta tabla se encarga del versionado de los documentos en sí. Al crear un nuevo documento, se forma un área específica para dicho documento, en la cual podemos agregar nuevas versiones. Esta tabla tiene varias conexiones a otras tablas, con la cual se puede controlar toda la información de las nuevas versiones que se suban de los documentos. </w:t>
+      </w:r>
+    </w:p>
+    <w:p>
+      <w:pPr>
+        <w:rPr>
+          <w:rFonts w:ascii="Arial" w:hAnsi="Arial" w:cs="Arial"/>
+          <w:lang w:val="es-SV"/>
+        </w:rPr>
+      </w:pPr>
+      <w:r>
+        <w:rPr>
+          <w:rFonts w:ascii="Arial" w:hAnsi="Arial" w:cs="Arial"/>
+          <w:lang w:val="es-SV"/>
+        </w:rPr>
+        <w:t xml:space="preserve">La tabla es la siguiente y contiene: </w:t>
+      </w:r>
+    </w:p>
+    <w:p>
+      <w:pPr>
+        <w:rPr>
+          <w:rFonts w:ascii="Arial" w:hAnsi="Arial" w:cs="Arial"/>
+          <w:lang w:val="es-SV"/>
+        </w:rPr>
+      </w:pPr>
+      <w:r>
+        <w:rPr>
+          <w:rFonts w:ascii="Arial" w:hAnsi="Arial" w:cs="Arial"/>
+          <w:lang w:val="es-SV"/>
+        </w:rPr>
+        <w:t xml:space="preserve">id_version: es el identificador del versionado del documento, muestra las versiones más recientes con números mayores. </w:t>
+      </w:r>
+    </w:p>
+    <w:p>
+      <w:pPr>
+        <w:rPr>
+          <w:rFonts w:ascii="Arial" w:hAnsi="Arial" w:cs="Arial"/>
+          <w:lang w:val="es-SV"/>
+        </w:rPr>
+      </w:pPr>
+      <w:r>
+        <w:rPr>
+          <w:rFonts w:ascii="Arial" w:hAnsi="Arial" w:cs="Arial"/>
+          <w:lang w:val="es-SV"/>
+        </w:rPr>
+        <w:t xml:space="preserve">id_documento: es el identificador del documento en sí, acá se hace una conexión a la tabla de documentos para especificar cual documento es. </w:t>
+      </w:r>
+    </w:p>
+    <w:p>
+      <w:pPr>
+        <w:rPr>
+          <w:rFonts w:ascii="Arial" w:hAnsi="Arial" w:cs="Arial"/>
+          <w:lang w:val="es-SV"/>
+        </w:rPr>
+      </w:pPr>
+      <w:r>
+        <w:rPr>
+          <w:rFonts w:ascii="Arial" w:hAnsi="Arial" w:cs="Arial"/>
+          <w:lang w:val="es-SV"/>
+        </w:rPr>
+        <w:t>numero_version: es la versión que se estará subiendo del documento. Si antes estaba la versión 1, la nueva versión será versión 2</w:t>
+      </w:r>
+    </w:p>
+    <w:p>
+      <w:pPr>
+        <w:jc w:val="both"/>
+        <w:rPr>
+          <w:rFonts w:ascii="Arial" w:hAnsi="Arial" w:cs="Arial"/>
+          <w:lang w:val="es-SV"/>
+        </w:rPr>
+      </w:pPr>
+      <w:r>
+        <w:rPr>
+          <w:rFonts w:ascii="Arial" w:hAnsi="Arial" w:cs="Arial"/>
+          <w:lang w:val="es-SV"/>
+        </w:rPr>
+        <w:t xml:space="preserve">ruta_archivo: es donde se guardará la nueva versión del documento para poder acceder a él para bajarlo o revisarlo. </w:t>
+      </w:r>
+    </w:p>
+    <w:p>
+      <w:pPr>
+        <w:rPr>
+          <w:rFonts w:ascii="Arial" w:hAnsi="Arial" w:cs="Arial"/>
+          <w:lang w:val="es-SV"/>
+        </w:rPr>
+      </w:pPr>
+      <w:r>
+        <w:rPr>
+          <w:rFonts w:ascii="Arial" w:hAnsi="Arial" w:cs="Arial"/>
+          <w:lang w:val="es-SV"/>
+        </w:rPr>
+        <w:lastRenderedPageBreak/>
+        <w:t xml:space="preserve">estado: esto muestra el estado de la versión del documento. Está en pendiente de forma estándar hasta que sea aceptado o rechazado por un jefe o administrador. </w:t>
+      </w:r>
+    </w:p>
+    <w:p>
+      <w:pPr>
+        <w:rPr>
+          <w:rFonts w:ascii="Arial" w:hAnsi="Arial" w:cs="Arial"/>
+          <w:lang w:val="es-SV"/>
+        </w:rPr>
+      </w:pPr>
+      <w:r>
+        <w:rPr>
+          <w:rFonts w:ascii="Arial" w:hAnsi="Arial" w:cs="Arial"/>
+          <w:lang w:val="es-SV"/>
+        </w:rPr>
+        <w:t>subido_por: una conexión con la tabla de usuarios, con la cual podemos identificar quien es el que subió esta versión del documento.</w:t>
+      </w:r>
+    </w:p>
+    <w:p>
+      <w:pPr>
+        <w:rPr>
+          <w:rFonts w:ascii="Arial" w:hAnsi="Arial" w:cs="Arial"/>
+          <w:lang w:val="es-SV"/>
+        </w:rPr>
+      </w:pPr>
+      <w:r>
+        <w:rPr>
+          <w:rFonts w:ascii="Arial" w:hAnsi="Arial" w:cs="Arial"/>
+          <w:lang w:val="es-SV"/>
+        </w:rPr>
+        <w:t xml:space="preserve">aprobado_por: relación con la tabla de usuarios, con la cual se puede identificar quien aprobó o rechazo esta versión del documento. </w:t>
+      </w:r>
+    </w:p>
+    <w:p>
+      <w:pPr>
+        <w:rPr>
+          <w:rFonts w:ascii="Arial" w:hAnsi="Arial" w:cs="Arial"/>
+          <w:lang w:val="es-SV"/>
+        </w:rPr>
+      </w:pPr>
+      <w:r>
+        <w:rPr>
+          <w:rFonts w:ascii="Arial" w:hAnsi="Arial" w:cs="Arial"/>
+          <w:lang w:val="es-SV"/>
+        </w:rPr>
+        <w:t xml:space="preserve">fecha_subida: muestra la fecha en la que se subió la versión del documento.  </w:t>
+      </w:r>
+    </w:p>
+    <w:p>
+      <w:pPr>
+        <w:rPr>
+          <w:rFonts w:ascii="Arial" w:hAnsi="Arial" w:cs="Arial"/>
+          <w:lang w:val="es-SV"/>
+        </w:rPr>
+      </w:pPr>
+      <w:r>
+        <w:rPr>
+          <w:rFonts w:ascii="Arial" w:hAnsi="Arial" w:cs="Arial"/>
+          <w:lang w:val="es-SV"/>
+        </w:rPr>
+        <w:t>fecha_aprobacion: muestra la fecha en la que se aprobó o rechazo la versión del documento.</w:t>
+      </w:r>
+    </w:p>
+    <w:p>
+      <w:pPr>
+        <w:rPr>
+          <w:rFonts w:ascii="Arial" w:hAnsi="Arial" w:cs="Arial"/>
+          <w:lang w:val="es-SV"/>
+        </w:rPr>
+      </w:pPr>
+      <w:r>
+        <w:rPr>
+          <w:rFonts w:ascii="Arial" w:hAnsi="Arial" w:cs="Arial"/>
+          <w:lang w:val="es-SV"/>
+        </w:rPr>
+        <w:t xml:space="preserve">fecha_revision: muestra la fecha en la que se revisó la versión del documento. </w:t>
+      </w:r>
+    </w:p>
+    <w:p>
+      <w:pPr>
+        <w:jc w:val="center"/>
+        <w:rPr>
+          <w:rFonts w:ascii="Arial" w:hAnsi="Arial" w:cs="Arial"/>
+          <w:lang w:val="es-SV"/>
+        </w:rPr>
+      </w:pPr>
+      <w:r>
+        <w:rPr>
+          <w:rFonts w:ascii="Arial" w:hAnsi="Arial" w:cs="Arial"/>
+          <w:noProof/>
+          <w:lang w:val="es-SV" w:eastAsia="es-SV"/>
+        </w:rPr>
+        <w:drawing>
+          <wp:inline distT="0" distB="0" distL="0" distR="0" wp14:anchorId="7F901B3B" wp14:editId="5671ADD4">
+            <wp:extent cx="5791702" cy="1158340"/>
+            <wp:effectExtent l="0" t="0" r="0" b="3810"/>
+            <wp:docPr id="4" name="Imagen 4"/>
+            <wp:cNvGraphicFramePr>
+              <a:graphicFrameLocks xmlns:a="http://schemas.openxmlformats.org/drawingml/2006/main" noChangeAspect="1"/>
+            </wp:cNvGraphicFramePr>
+            <a:graphic xmlns:a="http://schemas.openxmlformats.org/drawingml/2006/main">
+              <a:graphicData uri="http://schemas.openxmlformats.org/drawingml/2006/picture">
+                <pic:pic xmlns:pic="http://schemas.openxmlformats.org/drawingml/2006/picture">
+                  <pic:nvPicPr>
+                    <pic:cNvPr id="1" name=""/>
+                    <pic:cNvPicPr/>
+                  </pic:nvPicPr>
+                  <pic:blipFill>
+                    <a:blip r:embed="rId13"/>
+                    <a:stretch>
+                      <a:fillRect/>
+                    </a:stretch>
+                  </pic:blipFill>
+                  <pic:spPr>
+                    <a:xfrm>
+                      <a:off x="0" y="0"/>
+                      <a:ext cx="5791702" cy="1158340"/>
+                    </a:xfrm>
+                    <a:prstGeom prst="rect">
+                      <a:avLst/>
+                    </a:prstGeom>
+                  </pic:spPr>
+                </pic:pic>
+              </a:graphicData>
+            </a:graphic>
+          </wp:inline>
+        </w:drawing>
+      </w:r>
+    </w:p>
+    <w:p>
+      <w:pPr>
+        <w:rPr>
+          <w:rFonts w:ascii="Arial" w:hAnsi="Arial" w:cs="Arial"/>
+          <w:lang w:val="es-SV"/>
+        </w:rPr>
+      </w:pPr>
+    </w:p>
+    <w:p>
+      <w:pPr>
+        <w:jc w:val="center"/>
+        <w:rPr>
+          <w:rFonts w:ascii="Arial" w:hAnsi="Arial" w:cs="Arial"/>
+          <w:lang w:val="es-SV"/>
+        </w:rPr>
+      </w:pPr>
+      <w:r>
+        <w:rPr>
+          <w:rFonts w:ascii="Arial" w:hAnsi="Arial" w:cs="Arial"/>
+          <w:lang w:val="es-SV"/>
+        </w:rPr>
+        <w:t>Bitácora</w:t>
+      </w:r>
+    </w:p>
+    <w:p>
+      <w:pPr>
+        <w:rPr>
+          <w:rFonts w:ascii="Arial" w:hAnsi="Arial" w:cs="Arial"/>
+          <w:lang w:val="es-SV"/>
+        </w:rPr>
+      </w:pPr>
+      <w:r>
+        <w:rPr>
+          <w:rFonts w:ascii="Arial" w:hAnsi="Arial" w:cs="Arial"/>
+          <w:lang w:val="es-SV"/>
+        </w:rPr>
+        <w:t xml:space="preserve">Esta tabla se encarga de mantener toda la información relacionada a los documentos y las distintas versiones de estos. Es por medio de esto que se puede revisar quien subió el documento, quien lo aprobó, la versión del documento y la fecha cuando se hizo esto. </w:t>
+      </w:r>
+    </w:p>
+    <w:p>
+      <w:pPr>
+        <w:rPr>
+          <w:rFonts w:ascii="Arial" w:hAnsi="Arial" w:cs="Arial"/>
+          <w:lang w:val="es-SV"/>
+        </w:rPr>
+      </w:pPr>
+      <w:r>
+        <w:rPr>
+          <w:rFonts w:ascii="Arial" w:hAnsi="Arial" w:cs="Arial"/>
+          <w:lang w:val="es-SV"/>
+        </w:rPr>
+        <w:t xml:space="preserve">La tabla es la siguiente y contiene: </w:t>
+      </w:r>
+    </w:p>
+    <w:p>
+      <w:pPr>
+        <w:rPr>
+          <w:rFonts w:ascii="Arial" w:hAnsi="Arial" w:cs="Arial"/>
+          <w:lang w:val="es-SV"/>
+        </w:rPr>
+      </w:pPr>
+      <w:r>
+        <w:rPr>
+          <w:rFonts w:ascii="Arial" w:hAnsi="Arial" w:cs="Arial"/>
+          <w:lang w:val="es-SV"/>
+        </w:rPr>
+        <w:t xml:space="preserve">id_evento: es el identificador por el cual se guardan los distintos eventos, como quien subió un documento o una nueva versión del documento. </w:t>
+      </w:r>
+    </w:p>
+    <w:p>
+      <w:pPr>
+        <w:rPr>
+          <w:rFonts w:ascii="Arial" w:hAnsi="Arial" w:cs="Arial"/>
+          <w:lang w:val="es-SV"/>
+        </w:rPr>
+      </w:pPr>
+      <w:r>
+        <w:rPr>
+          <w:rFonts w:ascii="Arial" w:hAnsi="Arial" w:cs="Arial"/>
+          <w:lang w:val="es-SV"/>
+        </w:rPr>
+        <w:t xml:space="preserve"> id_usuario: una conexión con la tabla de usuarios, con la cual podemos identificar quien es el que subió el documento por medio del id de ellos. </w:t>
+      </w:r>
+    </w:p>
+    <w:p>
+      <w:pPr>
+        <w:rPr>
+          <w:rFonts w:ascii="Arial" w:hAnsi="Arial" w:cs="Arial"/>
+          <w:lang w:val="es-SV"/>
+        </w:rPr>
+      </w:pPr>
+      <w:r>
+        <w:rPr>
+          <w:rFonts w:ascii="Arial" w:hAnsi="Arial" w:cs="Arial"/>
+          <w:lang w:val="es-SV"/>
+        </w:rPr>
+        <w:t xml:space="preserve">id_version: una conexión con la tabla de versiones_documento, con la cual podemos ver cual versión es por medio de su id. </w:t>
+      </w:r>
+    </w:p>
+    <w:p>
+      <w:pPr>
+        <w:rPr>
+          <w:rFonts w:ascii="Arial" w:hAnsi="Arial" w:cs="Arial"/>
+          <w:lang w:val="es-SV"/>
+        </w:rPr>
+      </w:pPr>
+      <w:r>
+        <w:rPr>
+          <w:rFonts w:ascii="Arial" w:hAnsi="Arial" w:cs="Arial"/>
+          <w:lang w:val="es-SV"/>
+        </w:rPr>
+        <w:t xml:space="preserve">acción: Que acción se tomó, ya sea subir un documento, aprobar un documento o rechazar uno. </w:t>
+      </w:r>
+    </w:p>
+    <w:p>
+      <w:pPr>
+        <w:rPr>
+          <w:rFonts w:ascii="Arial" w:hAnsi="Arial" w:cs="Arial"/>
+          <w:lang w:val="es-SV"/>
+        </w:rPr>
+      </w:pPr>
+      <w:r>
+        <w:rPr>
+          <w:rFonts w:ascii="Arial" w:hAnsi="Arial" w:cs="Arial"/>
+          <w:lang w:val="es-SV"/>
+        </w:rPr>
+        <w:t>fecha: La fecha en la que ocurrió el evento.</w:t>
+      </w:r>
+    </w:p>
+    <w:p>
+      <w:pPr>
+        <w:rPr>
+          <w:rFonts w:ascii="Arial" w:hAnsi="Arial" w:cs="Arial"/>
+          <w:lang w:val="es-SV"/>
+        </w:rPr>
+      </w:pPr>
+      <w:r>
+        <w:rPr>
+          <w:rFonts w:ascii="Arial" w:hAnsi="Arial" w:cs="Arial"/>
+          <w:noProof/>
+          <w:lang w:val="es-SV" w:eastAsia="es-SV"/>
+        </w:rPr>
+        <w:lastRenderedPageBreak/>
+        <w:drawing>
+          <wp:inline distT="0" distB="0" distL="0" distR="0" wp14:anchorId="6226808B" wp14:editId="7A1E4F3A">
+            <wp:extent cx="5943600" cy="699135"/>
+            <wp:effectExtent l="0" t="0" r="0" b="5715"/>
+            <wp:docPr id="5" name="Imagen 5"/>
+            <wp:cNvGraphicFramePr>
+              <a:graphicFrameLocks xmlns:a="http://schemas.openxmlformats.org/drawingml/2006/main" noChangeAspect="1"/>
+            </wp:cNvGraphicFramePr>
+            <a:graphic xmlns:a="http://schemas.openxmlformats.org/drawingml/2006/main">
+              <a:graphicData uri="http://schemas.openxmlformats.org/drawingml/2006/picture">
+                <pic:pic xmlns:pic="http://schemas.openxmlformats.org/drawingml/2006/picture">
+                  <pic:nvPicPr>
+                    <pic:cNvPr id="1" name=""/>
+                    <pic:cNvPicPr/>
+                  </pic:nvPicPr>
+                  <pic:blipFill>
+                    <a:blip r:embed="rId14"/>
+                    <a:stretch>
+                      <a:fillRect/>
+                    </a:stretch>
+                  </pic:blipFill>
+                  <pic:spPr>
+                    <a:xfrm>
+                      <a:off x="0" y="0"/>
+                      <a:ext cx="5943600" cy="699135"/>
+                    </a:xfrm>
+                    <a:prstGeom prst="rect">
+                      <a:avLst/>
+                    </a:prstGeom>
+                  </pic:spPr>
+                </pic:pic>
+              </a:graphicData>
+            </a:graphic>
+          </wp:inline>
+        </w:drawing>
+      </w:r>
+    </w:p>
+    <w:p>
+      <w:pPr>
+        <w:rPr>
+          <w:rFonts w:ascii="Arial" w:hAnsi="Arial" w:cs="Arial"/>
+          <w:lang w:val="es-SV"/>
+        </w:rPr>
+      </w:pPr>
+    </w:p>
+    <w:p>
+      <w:pPr>
+        <w:jc w:val="center"/>
+        <w:rPr>
+          <w:rFonts w:ascii="Arial" w:hAnsi="Arial" w:cs="Arial"/>
+          <w:lang w:val="es-SV"/>
+        </w:rPr>
+      </w:pPr>
+      <w:r>
+        <w:rPr>
+          <w:rFonts w:ascii="Arial" w:hAnsi="Arial" w:cs="Arial"/>
+          <w:lang w:val="es-SV"/>
+        </w:rPr>
+        <w:t>Comentarios</w:t>
+      </w:r>
+    </w:p>
+    <w:p>
+      <w:pPr>
+        <w:rPr>
+          <w:rFonts w:ascii="Arial" w:hAnsi="Arial" w:cs="Arial"/>
+          <w:lang w:val="es-SV"/>
+        </w:rPr>
+      </w:pPr>
+      <w:r>
+        <w:rPr>
+          <w:rFonts w:ascii="Arial" w:hAnsi="Arial" w:cs="Arial"/>
+          <w:lang w:val="es-SV"/>
+        </w:rPr>
+        <w:t xml:space="preserve">Esta tabla se encarga de mantener la información relacionada a los comentarios. Es por medio de esta en la cual podemos saber quién subió cada comentario, la fecha de esto y el comentario en sí. </w:t>
+      </w:r>
+    </w:p>
+    <w:p>
+      <w:pPr>
+        <w:rPr>
+          <w:rFonts w:ascii="Arial" w:hAnsi="Arial" w:cs="Arial"/>
+          <w:lang w:val="es-SV"/>
+        </w:rPr>
+      </w:pPr>
+      <w:r>
+        <w:rPr>
+          <w:rFonts w:ascii="Arial" w:hAnsi="Arial" w:cs="Arial"/>
+          <w:lang w:val="es-SV"/>
+        </w:rPr>
+        <w:t xml:space="preserve">La tabla es la siguiente y contiene: </w:t>
+      </w:r>
+    </w:p>
+    <w:p>
+      <w:pPr>
+        <w:rPr>
+          <w:rFonts w:ascii="Arial" w:hAnsi="Arial" w:cs="Arial"/>
+          <w:lang w:val="es-SV"/>
+        </w:rPr>
+      </w:pPr>
+      <w:r>
+        <w:rPr>
+          <w:rFonts w:ascii="Arial" w:hAnsi="Arial" w:cs="Arial"/>
+          <w:lang w:val="es-SV"/>
+        </w:rPr>
+        <w:t xml:space="preserve">id_comentario: es el identificador con el que se guardan los respectivos comentarios. </w:t>
+      </w:r>
+    </w:p>
+    <w:p>
+      <w:pPr>
+        <w:rPr>
+          <w:rFonts w:ascii="Arial" w:hAnsi="Arial" w:cs="Arial"/>
+          <w:lang w:val="es-SV"/>
+        </w:rPr>
+      </w:pPr>
+      <w:r>
+        <w:rPr>
+          <w:rFonts w:ascii="Arial" w:hAnsi="Arial" w:cs="Arial"/>
+          <w:lang w:val="es-SV"/>
+        </w:rPr>
+        <w:t>id_version: es una conexión con la tabla de versiones_documento, con la cual podemos ver cual versión es por medio de su id.</w:t>
+      </w:r>
+    </w:p>
+    <w:p>
+      <w:pPr>
+        <w:rPr>
+          <w:rFonts w:ascii="Arial" w:hAnsi="Arial" w:cs="Arial"/>
+          <w:lang w:val="es-SV"/>
+        </w:rPr>
+      </w:pPr>
+      <w:r>
+        <w:rPr>
+          <w:rFonts w:ascii="Arial" w:hAnsi="Arial" w:cs="Arial"/>
+          <w:lang w:val="es-SV"/>
+        </w:rPr>
+        <w:t xml:space="preserve">id_usuario: una conexión con la tabla de usuarios, con la cual podemos identificar quien es el que subió el documento por medio del id de ellos. </w:t>
+      </w:r>
+    </w:p>
+    <w:p>
+      <w:pPr>
+        <w:rPr>
+          <w:rFonts w:ascii="Arial" w:hAnsi="Arial" w:cs="Arial"/>
+          <w:lang w:val="es-SV"/>
+        </w:rPr>
+      </w:pPr>
+      <w:r>
+        <w:rPr>
+          <w:rFonts w:ascii="Arial" w:hAnsi="Arial" w:cs="Arial"/>
+          <w:lang w:val="es-SV"/>
+        </w:rPr>
+        <w:t xml:space="preserve">comentario: es el comentario que se pone en el documento. </w:t>
+      </w:r>
+    </w:p>
+    <w:p>
+      <w:pPr>
+        <w:rPr>
+          <w:rFonts w:ascii="Arial" w:hAnsi="Arial" w:cs="Arial"/>
+          <w:lang w:val="es-SV"/>
+        </w:rPr>
+      </w:pPr>
+      <w:r>
+        <w:rPr>
+          <w:rFonts w:ascii="Arial" w:hAnsi="Arial" w:cs="Arial"/>
+          <w:lang w:val="es-SV"/>
+        </w:rPr>
+        <w:t>fecha: es la fecha en la cual se subió el comentario.</w:t>
+      </w:r>
+    </w:p>
+    <w:p>
+      <w:pPr>
+        <w:jc w:val="center"/>
+        <w:rPr>
+          <w:rFonts w:ascii="Arial" w:hAnsi="Arial" w:cs="Arial"/>
+          <w:lang w:val="es-SV"/>
+        </w:rPr>
+      </w:pPr>
+      <w:r>
+        <w:rPr>
+          <w:rFonts w:ascii="Arial" w:hAnsi="Arial" w:cs="Arial"/>
+          <w:noProof/>
+          <w:lang w:val="es-SV" w:eastAsia="es-SV"/>
+        </w:rPr>
+        <w:drawing>
+          <wp:inline distT="0" distB="0" distL="0" distR="0" wp14:anchorId="77D25223" wp14:editId="5AA60279">
+            <wp:extent cx="5730737" cy="701101"/>
+            <wp:effectExtent l="0" t="0" r="3810" b="3810"/>
+            <wp:docPr id="6" name="Imagen 6"/>
+            <wp:cNvGraphicFramePr>
+              <a:graphicFrameLocks xmlns:a="http://schemas.openxmlformats.org/drawingml/2006/main" noChangeAspect="1"/>
+            </wp:cNvGraphicFramePr>
+            <a:graphic xmlns:a="http://schemas.openxmlformats.org/drawingml/2006/main">
+              <a:graphicData uri="http://schemas.openxmlformats.org/drawingml/2006/picture">
+                <pic:pic xmlns:pic="http://schemas.openxmlformats.org/drawingml/2006/picture">
+                  <pic:nvPicPr>
+                    <pic:cNvPr id="1" name=""/>
+                    <pic:cNvPicPr/>
+                  </pic:nvPicPr>
+                  <pic:blipFill>
+                    <a:blip r:embed="rId15"/>
+                    <a:stretch>
+                      <a:fillRect/>
+                    </a:stretch>
+                  </pic:blipFill>
+                  <pic:spPr>
+                    <a:xfrm>
+                      <a:off x="0" y="0"/>
+                      <a:ext cx="5730737" cy="701101"/>
+                    </a:xfrm>
+                    <a:prstGeom prst="rect">
+                      <a:avLst/>
+                    </a:prstGeom>
+                  </pic:spPr>
+                </pic:pic>
+              </a:graphicData>
+            </a:graphic>
+          </wp:inline>
+        </w:drawing>
+      </w:r>
+    </w:p>
+    <w:p>
+      <w:pPr>
+        <w:rPr>
+          <w:rFonts w:ascii="Arial" w:hAnsi="Arial" w:cs="Arial"/>
+          <w:lang w:val="es-ES"/>
+        </w:rPr>
+      </w:pPr>
+      <w:bookmarkStart w:id="5" w:name="_GoBack"/>
+      <w:bookmarkEnd w:id="5"/>
     </w:p>
     <w:p>
       <w:pPr>
@@ -1822,7 +4775,7 @@
           <w:lang w:val="es-SV"/>
         </w:rPr>
       </w:pPr>
-      <w:bookmarkStart w:id="3" w:name="_Toc224899160"/>
+      <w:bookmarkStart w:id="6" w:name="_Toc224899160"/>
       <w:r>
         <w:rPr>
           <w:rFonts w:ascii="Arial" w:hAnsi="Arial" w:cs="Arial"/>
@@ -1836,7 +4789,7 @@
         <w:lastRenderedPageBreak/>
         <w:t>UML Minimo</w:t>
       </w:r>
-      <w:bookmarkEnd w:id="3"/>
+      <w:bookmarkEnd w:id="6"/>
     </w:p>
     <w:p>
       <w:pPr>
@@ -1849,7 +4802,7 @@
           <w:lang w:val="es-SV"/>
         </w:rPr>
       </w:pPr>
-      <w:bookmarkStart w:id="4" w:name="_Toc224899161"/>
+      <w:bookmarkStart w:id="7" w:name="_Toc224899161"/>
       <w:r>
         <w:rPr>
           <w:rFonts w:ascii="Arial" w:hAnsi="Arial" w:cs="Arial"/>
@@ -1860,7 +4813,7 @@
         </w:rPr>
         <w:t>Problema actual</w:t>
       </w:r>
-      <w:bookmarkEnd w:id="4"/>
+      <w:bookmarkEnd w:id="7"/>
     </w:p>
     <w:p>
       <w:pPr>
@@ -2095,7 +5048,7 @@
           <w:lang w:val="es-SV"/>
         </w:rPr>
       </w:pPr>
-      <w:bookmarkStart w:id="5" w:name="_Toc224899162"/>
+      <w:bookmarkStart w:id="8" w:name="_Toc224899162"/>
       <w:r>
         <w:rPr>
           <w:rFonts w:ascii="Arial" w:hAnsi="Arial" w:cs="Arial"/>
@@ -2108,7 +5061,7 @@
         </w:rPr>
         <w:t>Modelos de Datos (ER)</w:t>
       </w:r>
-      <w:bookmarkEnd w:id="5"/>
+      <w:bookmarkEnd w:id="8"/>
     </w:p>
     <w:p>
       <w:pPr>
@@ -2279,7 +5232,7 @@
           <w:lang w:val="es-SV"/>
         </w:rPr>
       </w:pPr>
-      <w:bookmarkStart w:id="6" w:name="_Toc224899163"/>
+      <w:bookmarkStart w:id="9" w:name="_Toc224899163"/>
       <w:r>
         <w:rPr>
           <w:rFonts w:ascii="Arial" w:hAnsi="Arial" w:cs="Arial"/>
@@ -2292,7 +5245,7 @@
         </w:rPr>
         <w:t>Prototipo</w:t>
       </w:r>
-      <w:bookmarkEnd w:id="6"/>
+      <w:bookmarkEnd w:id="9"/>
     </w:p>
     <w:p>
       <w:pPr>
@@ -2316,7 +5269,7 @@
           <w:lang w:val="es-SV"/>
         </w:rPr>
       </w:pPr>
-      <w:bookmarkStart w:id="7" w:name="_Toc224899164"/>
+      <w:bookmarkStart w:id="10" w:name="_Toc224899164"/>
       <w:r>
         <w:rPr>
           <w:rFonts w:ascii="Arial" w:hAnsi="Arial" w:cs="Arial"/>
@@ -2330,7 +5283,7 @@
         <w:lastRenderedPageBreak/>
         <w:t>Repositorio de Github</w:t>
       </w:r>
-      <w:bookmarkEnd w:id="7"/>
+      <w:bookmarkEnd w:id="10"/>
     </w:p>
     <w:p>
       <w:pPr>
@@ -2340,7 +5293,7 @@
           <w:lang w:val="es-ES"/>
         </w:rPr>
       </w:pPr>
-      <w:hyperlink r:id="rId10" w:history="1">
+      <w:hyperlink r:id="rId16" w:history="1">
         <w:r>
           <w:rPr>
             <w:rStyle w:val="Hipervnculo"/>
@@ -2457,8 +5410,8 @@
       </w:pPr>
     </w:p>
     <w:sectPr>
-      <w:headerReference w:type="default" r:id="rId11"/>
-      <w:headerReference w:type="first" r:id="rId12"/>
+      <w:headerReference w:type="default" r:id="rId17"/>
+      <w:headerReference w:type="first" r:id="rId18"/>
       <w:pgSz w:w="12240" w:h="15840"/>
       <w:pgMar w:top="1440" w:right="1440" w:bottom="1440" w:left="1440" w:header="720" w:footer="720" w:gutter="0"/>
       <w:pgNumType w:start="1"/>
@@ -2551,7 +5504,7 @@
             <w:noProof/>
             <w:lang w:val="es-ES"/>
           </w:rPr>
-          <w:t>5</w:t>
+          <w:t>3</w:t>
         </w:r>
         <w:r>
           <w:fldChar w:fldCharType="end"/>
@@ -3268,6 +6221,232 @@
     </w:lvl>
   </w:abstractNum>
   <w:abstractNum w:abstractNumId="6" w15:restartNumberingAfterBreak="0">
+    <w:nsid w:val="3C460EE7"/>
+    <w:multiLevelType w:val="hybridMultilevel"/>
+    <w:tmpl w:val="E2B6F69C"/>
+    <w:lvl w:ilvl="0" w:tplc="440A0001">
+      <w:start w:val="1"/>
+      <w:numFmt w:val="bullet"/>
+      <w:lvlText w:val=""/>
+      <w:lvlJc w:val="left"/>
+      <w:pPr>
+        <w:ind w:left="720" w:hanging="360"/>
+      </w:pPr>
+      <w:rPr>
+        <w:rFonts w:ascii="Symbol" w:hAnsi="Symbol" w:hint="default"/>
+      </w:rPr>
+    </w:lvl>
+    <w:lvl w:ilvl="1" w:tplc="440A0003">
+      <w:start w:val="1"/>
+      <w:numFmt w:val="bullet"/>
+      <w:lvlText w:val="o"/>
+      <w:lvlJc w:val="left"/>
+      <w:pPr>
+        <w:ind w:left="1440" w:hanging="360"/>
+      </w:pPr>
+      <w:rPr>
+        <w:rFonts w:ascii="Courier New" w:hAnsi="Courier New" w:cs="Courier New" w:hint="default"/>
+      </w:rPr>
+    </w:lvl>
+    <w:lvl w:ilvl="2" w:tplc="440A0005" w:tentative="1">
+      <w:start w:val="1"/>
+      <w:numFmt w:val="bullet"/>
+      <w:lvlText w:val=""/>
+      <w:lvlJc w:val="left"/>
+      <w:pPr>
+        <w:ind w:left="2160" w:hanging="360"/>
+      </w:pPr>
+      <w:rPr>
+        <w:rFonts w:ascii="Wingdings" w:hAnsi="Wingdings" w:hint="default"/>
+      </w:rPr>
+    </w:lvl>
+    <w:lvl w:ilvl="3" w:tplc="440A0001" w:tentative="1">
+      <w:start w:val="1"/>
+      <w:numFmt w:val="bullet"/>
+      <w:lvlText w:val=""/>
+      <w:lvlJc w:val="left"/>
+      <w:pPr>
+        <w:ind w:left="2880" w:hanging="360"/>
+      </w:pPr>
+      <w:rPr>
+        <w:rFonts w:ascii="Symbol" w:hAnsi="Symbol" w:hint="default"/>
+      </w:rPr>
+    </w:lvl>
+    <w:lvl w:ilvl="4" w:tplc="440A0003" w:tentative="1">
+      <w:start w:val="1"/>
+      <w:numFmt w:val="bullet"/>
+      <w:lvlText w:val="o"/>
+      <w:lvlJc w:val="left"/>
+      <w:pPr>
+        <w:ind w:left="3600" w:hanging="360"/>
+      </w:pPr>
+      <w:rPr>
+        <w:rFonts w:ascii="Courier New" w:hAnsi="Courier New" w:cs="Courier New" w:hint="default"/>
+      </w:rPr>
+    </w:lvl>
+    <w:lvl w:ilvl="5" w:tplc="440A0005" w:tentative="1">
+      <w:start w:val="1"/>
+      <w:numFmt w:val="bullet"/>
+      <w:lvlText w:val=""/>
+      <w:lvlJc w:val="left"/>
+      <w:pPr>
+        <w:ind w:left="4320" w:hanging="360"/>
+      </w:pPr>
+      <w:rPr>
+        <w:rFonts w:ascii="Wingdings" w:hAnsi="Wingdings" w:hint="default"/>
+      </w:rPr>
+    </w:lvl>
+    <w:lvl w:ilvl="6" w:tplc="440A0001" w:tentative="1">
+      <w:start w:val="1"/>
+      <w:numFmt w:val="bullet"/>
+      <w:lvlText w:val=""/>
+      <w:lvlJc w:val="left"/>
+      <w:pPr>
+        <w:ind w:left="5040" w:hanging="360"/>
+      </w:pPr>
+      <w:rPr>
+        <w:rFonts w:ascii="Symbol" w:hAnsi="Symbol" w:hint="default"/>
+      </w:rPr>
+    </w:lvl>
+    <w:lvl w:ilvl="7" w:tplc="440A0003" w:tentative="1">
+      <w:start w:val="1"/>
+      <w:numFmt w:val="bullet"/>
+      <w:lvlText w:val="o"/>
+      <w:lvlJc w:val="left"/>
+      <w:pPr>
+        <w:ind w:left="5760" w:hanging="360"/>
+      </w:pPr>
+      <w:rPr>
+        <w:rFonts w:ascii="Courier New" w:hAnsi="Courier New" w:cs="Courier New" w:hint="default"/>
+      </w:rPr>
+    </w:lvl>
+    <w:lvl w:ilvl="8" w:tplc="440A0005" w:tentative="1">
+      <w:start w:val="1"/>
+      <w:numFmt w:val="bullet"/>
+      <w:lvlText w:val=""/>
+      <w:lvlJc w:val="left"/>
+      <w:pPr>
+        <w:ind w:left="6480" w:hanging="360"/>
+      </w:pPr>
+      <w:rPr>
+        <w:rFonts w:ascii="Wingdings" w:hAnsi="Wingdings" w:hint="default"/>
+      </w:rPr>
+    </w:lvl>
+  </w:abstractNum>
+  <w:abstractNum w:abstractNumId="7" w15:restartNumberingAfterBreak="0">
+    <w:nsid w:val="3DD13E62"/>
+    <w:multiLevelType w:val="hybridMultilevel"/>
+    <w:tmpl w:val="FBE659A6"/>
+    <w:lvl w:ilvl="0" w:tplc="440A0001">
+      <w:start w:val="1"/>
+      <w:numFmt w:val="bullet"/>
+      <w:lvlText w:val=""/>
+      <w:lvlJc w:val="left"/>
+      <w:pPr>
+        <w:ind w:left="720" w:hanging="360"/>
+      </w:pPr>
+      <w:rPr>
+        <w:rFonts w:ascii="Symbol" w:hAnsi="Symbol" w:hint="default"/>
+      </w:rPr>
+    </w:lvl>
+    <w:lvl w:ilvl="1" w:tplc="440A0003" w:tentative="1">
+      <w:start w:val="1"/>
+      <w:numFmt w:val="bullet"/>
+      <w:lvlText w:val="o"/>
+      <w:lvlJc w:val="left"/>
+      <w:pPr>
+        <w:ind w:left="1440" w:hanging="360"/>
+      </w:pPr>
+      <w:rPr>
+        <w:rFonts w:ascii="Courier New" w:hAnsi="Courier New" w:cs="Courier New" w:hint="default"/>
+      </w:rPr>
+    </w:lvl>
+    <w:lvl w:ilvl="2" w:tplc="440A0005" w:tentative="1">
+      <w:start w:val="1"/>
+      <w:numFmt w:val="bullet"/>
+      <w:lvlText w:val=""/>
+      <w:lvlJc w:val="left"/>
+      <w:pPr>
+        <w:ind w:left="2160" w:hanging="360"/>
+      </w:pPr>
+      <w:rPr>
+        <w:rFonts w:ascii="Wingdings" w:hAnsi="Wingdings" w:hint="default"/>
+      </w:rPr>
+    </w:lvl>
+    <w:lvl w:ilvl="3" w:tplc="440A0001" w:tentative="1">
+      <w:start w:val="1"/>
+      <w:numFmt w:val="bullet"/>
+      <w:lvlText w:val=""/>
+      <w:lvlJc w:val="left"/>
+      <w:pPr>
+        <w:ind w:left="2880" w:hanging="360"/>
+      </w:pPr>
+      <w:rPr>
+        <w:rFonts w:ascii="Symbol" w:hAnsi="Symbol" w:hint="default"/>
+      </w:rPr>
+    </w:lvl>
+    <w:lvl w:ilvl="4" w:tplc="440A0003" w:tentative="1">
+      <w:start w:val="1"/>
+      <w:numFmt w:val="bullet"/>
+      <w:lvlText w:val="o"/>
+      <w:lvlJc w:val="left"/>
+      <w:pPr>
+        <w:ind w:left="3600" w:hanging="360"/>
+      </w:pPr>
+      <w:rPr>
+        <w:rFonts w:ascii="Courier New" w:hAnsi="Courier New" w:cs="Courier New" w:hint="default"/>
+      </w:rPr>
+    </w:lvl>
+    <w:lvl w:ilvl="5" w:tplc="440A0005" w:tentative="1">
+      <w:start w:val="1"/>
+      <w:numFmt w:val="bullet"/>
+      <w:lvlText w:val=""/>
+      <w:lvlJc w:val="left"/>
+      <w:pPr>
+        <w:ind w:left="4320" w:hanging="360"/>
+      </w:pPr>
+      <w:rPr>
+        <w:rFonts w:ascii="Wingdings" w:hAnsi="Wingdings" w:hint="default"/>
+      </w:rPr>
+    </w:lvl>
+    <w:lvl w:ilvl="6" w:tplc="440A0001" w:tentative="1">
+      <w:start w:val="1"/>
+      <w:numFmt w:val="bullet"/>
+      <w:lvlText w:val=""/>
+      <w:lvlJc w:val="left"/>
+      <w:pPr>
+        <w:ind w:left="5040" w:hanging="360"/>
+      </w:pPr>
+      <w:rPr>
+        <w:rFonts w:ascii="Symbol" w:hAnsi="Symbol" w:hint="default"/>
+      </w:rPr>
+    </w:lvl>
+    <w:lvl w:ilvl="7" w:tplc="440A0003" w:tentative="1">
+      <w:start w:val="1"/>
+      <w:numFmt w:val="bullet"/>
+      <w:lvlText w:val="o"/>
+      <w:lvlJc w:val="left"/>
+      <w:pPr>
+        <w:ind w:left="5760" w:hanging="360"/>
+      </w:pPr>
+      <w:rPr>
+        <w:rFonts w:ascii="Courier New" w:hAnsi="Courier New" w:cs="Courier New" w:hint="default"/>
+      </w:rPr>
+    </w:lvl>
+    <w:lvl w:ilvl="8" w:tplc="440A0005" w:tentative="1">
+      <w:start w:val="1"/>
+      <w:numFmt w:val="bullet"/>
+      <w:lvlText w:val=""/>
+      <w:lvlJc w:val="left"/>
+      <w:pPr>
+        <w:ind w:left="6480" w:hanging="360"/>
+      </w:pPr>
+      <w:rPr>
+        <w:rFonts w:ascii="Wingdings" w:hAnsi="Wingdings" w:hint="default"/>
+      </w:rPr>
+    </w:lvl>
+  </w:abstractNum>
+  <w:abstractNum w:abstractNumId="8" w15:restartNumberingAfterBreak="0">
     <w:nsid w:val="43B83B4D"/>
     <w:multiLevelType w:val="hybridMultilevel"/>
     <w:tmpl w:val="5CC66BDE"/>
@@ -3353,7 +6532,7 @@
       </w:pPr>
     </w:lvl>
   </w:abstractNum>
-  <w:abstractNum w:abstractNumId="7" w15:restartNumberingAfterBreak="0">
+  <w:abstractNum w:abstractNumId="9" w15:restartNumberingAfterBreak="0">
     <w:nsid w:val="4EBE21F7"/>
     <w:multiLevelType w:val="hybridMultilevel"/>
     <w:tmpl w:val="0AE43FAE"/>
@@ -3439,7 +6618,7 @@
       </w:pPr>
     </w:lvl>
   </w:abstractNum>
-  <w:abstractNum w:abstractNumId="8" w15:restartNumberingAfterBreak="0">
+  <w:abstractNum w:abstractNumId="10" w15:restartNumberingAfterBreak="0">
     <w:nsid w:val="6DF926CF"/>
     <w:multiLevelType w:val="hybridMultilevel"/>
     <w:tmpl w:val="08B0CCF8"/>
@@ -3552,7 +6731,7 @@
       </w:rPr>
     </w:lvl>
   </w:abstractNum>
-  <w:abstractNum w:abstractNumId="9" w15:restartNumberingAfterBreak="0">
+  <w:abstractNum w:abstractNumId="11" w15:restartNumberingAfterBreak="0">
     <w:nsid w:val="73776FBC"/>
     <w:multiLevelType w:val="hybridMultilevel"/>
     <w:tmpl w:val="A48E68F8"/>
@@ -3665,7 +6844,7 @@
       </w:rPr>
     </w:lvl>
   </w:abstractNum>
-  <w:abstractNum w:abstractNumId="10" w15:restartNumberingAfterBreak="0">
+  <w:abstractNum w:abstractNumId="12" w15:restartNumberingAfterBreak="0">
     <w:nsid w:val="76C25579"/>
     <w:multiLevelType w:val="hybridMultilevel"/>
     <w:tmpl w:val="B1802E90"/>
@@ -3751,7 +6930,7 @@
       </w:pPr>
     </w:lvl>
   </w:abstractNum>
-  <w:abstractNum w:abstractNumId="11" w15:restartNumberingAfterBreak="0">
+  <w:abstractNum w:abstractNumId="13" w15:restartNumberingAfterBreak="0">
     <w:nsid w:val="775A14E7"/>
     <w:multiLevelType w:val="hybridMultilevel"/>
     <w:tmpl w:val="08C2661A"/>
@@ -3865,10 +7044,10 @@
     </w:lvl>
   </w:abstractNum>
   <w:num w:numId="1">
-    <w:abstractNumId w:val="8"/>
+    <w:abstractNumId w:val="10"/>
   </w:num>
   <w:num w:numId="2">
-    <w:abstractNumId w:val="9"/>
+    <w:abstractNumId w:val="11"/>
   </w:num>
   <w:num w:numId="3">
     <w:abstractNumId w:val="2"/>
@@ -3877,16 +7056,16 @@
     <w:abstractNumId w:val="3"/>
   </w:num>
   <w:num w:numId="5">
-    <w:abstractNumId w:val="7"/>
+    <w:abstractNumId w:val="9"/>
   </w:num>
   <w:num w:numId="6">
-    <w:abstractNumId w:val="10"/>
+    <w:abstractNumId w:val="12"/>
   </w:num>
   <w:num w:numId="7">
     <w:abstractNumId w:val="5"/>
   </w:num>
   <w:num w:numId="8">
-    <w:abstractNumId w:val="6"/>
+    <w:abstractNumId w:val="8"/>
   </w:num>
   <w:num w:numId="9">
     <w:abstractNumId w:val="0"/>
@@ -3898,7 +7077,13 @@
     <w:abstractNumId w:val="1"/>
   </w:num>
   <w:num w:numId="12">
-    <w:abstractNumId w:val="11"/>
+    <w:abstractNumId w:val="13"/>
+  </w:num>
+  <w:num w:numId="13">
+    <w:abstractNumId w:val="7"/>
+  </w:num>
+  <w:num w:numId="14">
+    <w:abstractNumId w:val="6"/>
   </w:num>
 </w:numbering>
 </file>
@@ -5352,7 +8537,7 @@
 </file>
 
 <file path=customXml/itemProps1.xml><?xml version="1.0" encoding="utf-8"?>
-<ds:datastoreItem xmlns:ds="http://schemas.openxmlformats.org/officeDocument/2006/customXml" ds:itemID="{67126715-C5A9-4067-92FA-65F8C2A8DF18}">
+<ds:datastoreItem xmlns:ds="http://schemas.openxmlformats.org/officeDocument/2006/customXml" ds:itemID="{BE8556A2-91C8-4BF1-92C2-7FB01195B7A5}">
   <ds:schemaRefs>
     <ds:schemaRef ds:uri="http://schemas.openxmlformats.org/officeDocument/2006/bibliography"/>
   </ds:schemaRefs>

</xml_diff>